<commit_message>
Project Design Document Değiştirildi.
Project Design Document dosyasına diyagramlar ve tasarım örüntüleri eklendi.
</commit_message>
<xml_diff>
--- a/Docs/PA2 Part 1/Project Design Document.docx
+++ b/Docs/PA2 Part 1/Project Design Document.docx
@@ -1,6 +1,6 @@
 
 <file path=word/document.xml><?xml version="1.0" encoding="utf-8"?>
-<w:document xmlns:wpc="http://schemas.microsoft.com/office/word/2010/wordprocessingCanvas" xmlns:cx="http://schemas.microsoft.com/office/drawing/2014/chartex" xmlns:cx1="http://schemas.microsoft.com/office/drawing/2015/9/8/chartex" xmlns:cx2="http://schemas.microsoft.com/office/drawing/2015/10/21/chartex" xmlns:cx3="http://schemas.microsoft.com/office/drawing/2016/5/9/chartex" xmlns:cx4="http://schemas.microsoft.com/office/drawing/2016/5/10/chartex" xmlns:cx5="http://schemas.microsoft.com/office/drawing/2016/5/11/chartex" xmlns:cx6="http://schemas.microsoft.com/office/drawing/2016/5/12/chartex" xmlns:cx7="http://schemas.microsoft.com/office/drawing/2016/5/13/chartex" xmlns:cx8="http://schemas.microsoft.com/office/drawing/2016/5/14/chartex" xmlns:mc="http://schemas.openxmlformats.org/markup-compatibility/2006" xmlns:aink="http://schemas.microsoft.com/office/drawing/2016/ink" xmlns:am3d="http://schemas.microsoft.com/office/drawing/2017/model3d" xmlns:o="urn:schemas-microsoft-com:office:office" xmlns:oel="http://schemas.microsoft.com/office/2019/extlst" xmlns:r="http://schemas.openxmlformats.org/officeDocument/2006/relationships" xmlns:m="http://schemas.openxmlformats.org/officeDocument/2006/math" xmlns:v="urn:schemas-microsoft-com:vml" xmlns:wp14="http://schemas.microsoft.com/office/word/2010/wordprocessingDrawing" xmlns:wp="http://schemas.openxmlformats.org/drawingml/2006/wordprocessingDrawing" xmlns:w10="urn:schemas-microsoft-com:office:word" xmlns:w="http://schemas.openxmlformats.org/wordprocessingml/2006/main" xmlns:w14="http://schemas.microsoft.com/office/word/2010/wordml" xmlns:w15="http://schemas.microsoft.com/office/word/2012/wordml" xmlns:w16cex="http://schemas.microsoft.com/office/word/2018/wordml/cex" xmlns:w16cid="http://schemas.microsoft.com/office/word/2016/wordml/cid" xmlns:w16="http://schemas.microsoft.com/office/word/2018/wordml" xmlns:w16du="http://schemas.microsoft.com/office/word/2023/wordml/word16du" xmlns:w16sdtdh="http://schemas.microsoft.com/office/word/2020/wordml/sdtdatahash" xmlns:w16sdtfl="http://schemas.microsoft.com/office/word/2024/wordml/sdtformatlock" xmlns:w16se="http://schemas.microsoft.com/office/word/2015/wordml/symex" xmlns:wpg="http://schemas.microsoft.com/office/word/2010/wordprocessingGroup" xmlns:wpi="http://schemas.microsoft.com/office/word/2010/wordprocessingInk" xmlns:wne="http://schemas.microsoft.com/office/word/2006/wordml" xmlns:wps="http://schemas.microsoft.com/office/word/2010/wordprocessingShape" mc:Ignorable="w14 w15 w16se w16cid w16 w16cex w16sdtdh w16sdtfl w16du wp14">
+<w:document xmlns:wpc="http://schemas.microsoft.com/office/word/2010/wordprocessingCanvas" xmlns:cx="http://schemas.microsoft.com/office/drawing/2014/chartex" xmlns:cx1="http://schemas.microsoft.com/office/drawing/2015/9/8/chartex" xmlns:mc="http://schemas.openxmlformats.org/markup-compatibility/2006" xmlns:o="urn:schemas-microsoft-com:office:office" xmlns:r="http://schemas.openxmlformats.org/officeDocument/2006/relationships" xmlns:m="http://schemas.openxmlformats.org/officeDocument/2006/math" xmlns:v="urn:schemas-microsoft-com:vml" xmlns:wp14="http://schemas.microsoft.com/office/word/2010/wordprocessingDrawing" xmlns:wp="http://schemas.openxmlformats.org/drawingml/2006/wordprocessingDrawing" xmlns:w10="urn:schemas-microsoft-com:office:word" xmlns:w="http://schemas.openxmlformats.org/wordprocessingml/2006/main" xmlns:w14="http://schemas.microsoft.com/office/word/2010/wordml" xmlns:w15="http://schemas.microsoft.com/office/word/2012/wordml" xmlns:w16se="http://schemas.microsoft.com/office/word/2015/wordml/symex" xmlns:wpg="http://schemas.microsoft.com/office/word/2010/wordprocessingGroup" xmlns:wpi="http://schemas.microsoft.com/office/word/2010/wordprocessingInk" xmlns:wne="http://schemas.microsoft.com/office/word/2006/wordml" xmlns:wps="http://schemas.microsoft.com/office/word/2010/wordprocessingShape" mc:Ignorable="w14 w15 w16se wp14">
   <w:body>
     <w:p>
       <w:pPr>
@@ -54,6 +54,7 @@
       </w:pPr>
       <w:r>
         <w:rPr>
+          <w:rFonts w:ascii="Arial" w:hAnsi="Arial" w:cs="Arial"/>
           <w:noProof/>
           <w:lang w:val="tr-TR" w:eastAsia="tr-TR"/>
         </w:rPr>
@@ -133,16 +134,7 @@
           <w:sz w:val="32"/>
           <w:szCs w:val="32"/>
         </w:rPr>
-        <w:t xml:space="preserve">Project </w:t>
-      </w:r>
-      <w:r>
-        <w:rPr>
-          <w:rFonts w:ascii="Arial" w:hAnsi="Arial" w:cs="Arial"/>
-          <w:b/>
-          <w:sz w:val="32"/>
-          <w:szCs w:val="32"/>
-        </w:rPr>
-        <w:t>Design Document</w:t>
+        <w:t>Project Design Document</w:t>
       </w:r>
     </w:p>
     <w:p>
@@ -392,14 +384,7 @@
           <w:rFonts w:ascii="Arial" w:hAnsi="Arial" w:cs="Arial"/>
           <w:color w:val="auto"/>
         </w:rPr>
-        <w:t>1</w:t>
-      </w:r>
-      <w:r>
-        <w:rPr>
-          <w:rFonts w:ascii="Arial" w:hAnsi="Arial" w:cs="Arial"/>
-          <w:color w:val="auto"/>
-        </w:rPr>
-        <w:t>. Task Matrix</w:t>
+        <w:t>1. Task Matrix</w:t>
       </w:r>
     </w:p>
     <w:p>
@@ -557,13 +542,7 @@
               <w:rPr>
                 <w:rFonts w:ascii="Arial" w:hAnsi="Arial" w:cs="Arial"/>
               </w:rPr>
-              <w:t xml:space="preserve">System Overview bölümünün </w:t>
-            </w:r>
-            <w:r>
-              <w:rPr>
-                <w:rFonts w:ascii="Arial" w:hAnsi="Arial" w:cs="Arial"/>
-              </w:rPr>
-              <w:t>yazılması.</w:t>
+              <w:t>System Overview bölümünün yazılması.</w:t>
             </w:r>
           </w:p>
         </w:tc>
@@ -623,19 +602,7 @@
               <w:rPr>
                 <w:rFonts w:ascii="Arial" w:hAnsi="Arial" w:cs="Arial"/>
               </w:rPr>
-              <w:t>Implementation Details bölümünün</w:t>
-            </w:r>
-            <w:r>
-              <w:rPr>
-                <w:rFonts w:ascii="Arial" w:hAnsi="Arial" w:cs="Arial"/>
-              </w:rPr>
-              <w:t xml:space="preserve"> yazılması</w:t>
-            </w:r>
-            <w:r>
-              <w:rPr>
-                <w:rFonts w:ascii="Arial" w:hAnsi="Arial" w:cs="Arial"/>
-              </w:rPr>
-              <w:t>.</w:t>
+              <w:t>Implementation Details bölümünün yazılması.</w:t>
             </w:r>
           </w:p>
         </w:tc>
@@ -695,19 +662,7 @@
               <w:rPr>
                 <w:rFonts w:ascii="Arial" w:hAnsi="Arial" w:cs="Arial"/>
               </w:rPr>
-              <w:t>Implementation Details bölümünün</w:t>
-            </w:r>
-            <w:r>
-              <w:rPr>
-                <w:rFonts w:ascii="Arial" w:hAnsi="Arial" w:cs="Arial"/>
-              </w:rPr>
-              <w:t xml:space="preserve"> yazılması</w:t>
-            </w:r>
-            <w:r>
-              <w:rPr>
-                <w:rFonts w:ascii="Arial" w:hAnsi="Arial" w:cs="Arial"/>
-              </w:rPr>
-              <w:t>.</w:t>
+              <w:t>Implementation Details bölümünün yazılması.</w:t>
             </w:r>
           </w:p>
         </w:tc>
@@ -767,19 +722,7 @@
               <w:rPr>
                 <w:rFonts w:ascii="Arial" w:hAnsi="Arial" w:cs="Arial"/>
               </w:rPr>
-              <w:t>Use Case Support in De</w:t>
-            </w:r>
-            <w:r>
-              <w:rPr>
-                <w:rFonts w:ascii="Arial" w:hAnsi="Arial" w:cs="Arial"/>
-              </w:rPr>
-              <w:t>sign bölümünde gereksinimlerin belirlenmesi</w:t>
-            </w:r>
-            <w:r>
-              <w:rPr>
-                <w:rFonts w:ascii="Arial" w:hAnsi="Arial" w:cs="Arial"/>
-              </w:rPr>
-              <w:t>.</w:t>
+              <w:t>Use Case Support in Design bölümünde gereksinimlerin belirlenmesi.</w:t>
             </w:r>
           </w:p>
         </w:tc>
@@ -875,14 +818,7 @@
           <w:rFonts w:ascii="Arial" w:hAnsi="Arial" w:cs="Arial"/>
           <w:color w:val="auto"/>
         </w:rPr>
-        <w:t>2</w:t>
-      </w:r>
-      <w:r>
-        <w:rPr>
-          <w:rFonts w:ascii="Arial" w:hAnsi="Arial" w:cs="Arial"/>
-          <w:color w:val="auto"/>
-        </w:rPr>
-        <w:t>. System Overview</w:t>
+        <w:t>2. System Overview</w:t>
       </w:r>
     </w:p>
     <w:p>
@@ -979,6 +915,134 @@
           <w:rFonts w:ascii="Arial" w:hAnsi="Arial" w:cs="Arial"/>
         </w:rPr>
         <w:t>.</w:t>
+      </w:r>
+    </w:p>
+    <w:p>
+      <w:pPr>
+        <w:pStyle w:val="NormalWeb"/>
+        <w:rPr>
+          <w:rFonts w:ascii="Arial" w:hAnsi="Arial" w:cs="Arial"/>
+        </w:rPr>
+      </w:pPr>
+    </w:p>
+    <w:p>
+      <w:pPr>
+        <w:pStyle w:val="NormalWeb"/>
+        <w:rPr>
+          <w:rFonts w:ascii="Arial" w:hAnsi="Arial" w:cs="Arial"/>
+          <w:b/>
+        </w:rPr>
+      </w:pPr>
+      <w:r>
+        <w:rPr>
+          <w:rFonts w:ascii="Arial" w:hAnsi="Arial" w:cs="Arial"/>
+          <w:b/>
+        </w:rPr>
+        <w:t>Component Diagram (sistemin üst seviye yapısı):</w:t>
+      </w:r>
+    </w:p>
+    <w:p>
+      <w:pPr>
+        <w:pStyle w:val="NormalWeb"/>
+        <w:rPr>
+          <w:rFonts w:ascii="Arial" w:hAnsi="Arial" w:cs="Arial"/>
+        </w:rPr>
+      </w:pPr>
+      <w:r>
+        <w:rPr>
+          <w:rFonts w:ascii="Arial" w:hAnsi="Arial" w:cs="Arial"/>
+        </w:rPr>
+        <w:pict w14:anchorId="0A443EBE">
+          <v:shapetype id="_x0000_t75" coordsize="21600,21600" o:spt="75" o:preferrelative="t" path="m@4@5l@4@11@9@11@9@5xe" filled="f" stroked="f">
+            <v:stroke joinstyle="miter"/>
+            <v:formulas>
+              <v:f eqn="if lineDrawn pixelLineWidth 0"/>
+              <v:f eqn="sum @0 1 0"/>
+              <v:f eqn="sum 0 0 @1"/>
+              <v:f eqn="prod @2 1 2"/>
+              <v:f eqn="prod @3 21600 pixelWidth"/>
+              <v:f eqn="prod @3 21600 pixelHeight"/>
+              <v:f eqn="sum @0 0 1"/>
+              <v:f eqn="prod @6 1 2"/>
+              <v:f eqn="prod @7 21600 pixelWidth"/>
+              <v:f eqn="sum @8 21600 0"/>
+              <v:f eqn="prod @7 21600 pixelHeight"/>
+              <v:f eqn="sum @10 21600 0"/>
+            </v:formulas>
+            <v:path o:extrusionok="f" gradientshapeok="t" o:connecttype="rect"/>
+            <o:lock v:ext="edit" aspectratio="t"/>
+          </v:shapetype>
+          <v:shape id="_x0000_i1042" type="#_x0000_t75" style="width:468pt;height:241.8pt">
+            <v:imagedata r:id="rId6" o:title="component_diagram"/>
+          </v:shape>
+        </w:pict>
+      </w:r>
+    </w:p>
+    <w:p>
+      <w:pPr>
+        <w:pStyle w:val="NormalWeb"/>
+        <w:rPr>
+          <w:rFonts w:ascii="Arial" w:hAnsi="Arial" w:cs="Arial"/>
+        </w:rPr>
+      </w:pPr>
+    </w:p>
+    <w:p>
+      <w:pPr>
+        <w:pStyle w:val="NormalWeb"/>
+        <w:rPr>
+          <w:rFonts w:ascii="Arial" w:hAnsi="Arial" w:cs="Arial"/>
+        </w:rPr>
+      </w:pPr>
+    </w:p>
+    <w:p>
+      <w:pPr>
+        <w:pStyle w:val="NormalWeb"/>
+        <w:rPr>
+          <w:rFonts w:ascii="Arial" w:hAnsi="Arial" w:cs="Arial"/>
+        </w:rPr>
+      </w:pPr>
+    </w:p>
+    <w:p>
+      <w:pPr>
+        <w:pStyle w:val="NormalWeb"/>
+        <w:rPr>
+          <w:rFonts w:ascii="Arial" w:hAnsi="Arial" w:cs="Arial"/>
+        </w:rPr>
+      </w:pPr>
+    </w:p>
+    <w:p>
+      <w:pPr>
+        <w:pStyle w:val="NormalWeb"/>
+        <w:rPr>
+          <w:rFonts w:ascii="Arial" w:hAnsi="Arial" w:cs="Arial"/>
+          <w:b/>
+        </w:rPr>
+      </w:pPr>
+      <w:r>
+        <w:rPr>
+          <w:rFonts w:ascii="Arial" w:hAnsi="Arial" w:cs="Arial"/>
+          <w:b/>
+        </w:rPr>
+        <w:lastRenderedPageBreak/>
+        <w:t>Deployment Diagram (sistemin dağıtımı):</w:t>
+      </w:r>
+    </w:p>
+    <w:p>
+      <w:pPr>
+        <w:pStyle w:val="NormalWeb"/>
+        <w:rPr>
+          <w:rFonts w:ascii="Arial" w:hAnsi="Arial" w:cs="Arial"/>
+        </w:rPr>
+      </w:pPr>
+      <w:r>
+        <w:rPr>
+          <w:rFonts w:ascii="Arial" w:hAnsi="Arial" w:cs="Arial"/>
+        </w:rPr>
+        <w:pict w14:anchorId="45744019">
+          <v:shape id="_x0000_i1045" type="#_x0000_t75" style="width:467.45pt;height:224.05pt">
+            <v:imagedata r:id="rId7" o:title="deployment_diagram"/>
+          </v:shape>
+        </w:pict>
       </w:r>
     </w:p>
     <w:p>
@@ -1139,46 +1203,27 @@
     </w:p>
     <w:p>
       <w:pPr>
-        <w:rPr>
-          <w:rFonts w:ascii="Arial" w:hAnsi="Arial" w:cs="Arial"/>
-        </w:rPr>
-      </w:pPr>
-    </w:p>
-    <w:p>
-      <w:pPr>
-        <w:rPr>
-          <w:rFonts w:ascii="Arial" w:hAnsi="Arial" w:cs="Arial"/>
-        </w:rPr>
-      </w:pPr>
-    </w:p>
-    <w:p>
-      <w:pPr>
-        <w:rPr>
-          <w:rFonts w:ascii="Arial" w:hAnsi="Arial" w:cs="Arial"/>
-        </w:rPr>
-      </w:pPr>
-    </w:p>
-    <w:p>
-      <w:pPr>
         <w:pStyle w:val="Balk2"/>
         <w:rPr>
           <w:rFonts w:ascii="Arial" w:hAnsi="Arial" w:cs="Arial"/>
           <w:color w:val="auto"/>
         </w:rPr>
       </w:pPr>
-      <w:r>
+    </w:p>
+    <w:p>
+      <w:pPr>
+        <w:pStyle w:val="Balk2"/>
         <w:rPr>
           <w:rFonts w:ascii="Arial" w:hAnsi="Arial" w:cs="Arial"/>
           <w:color w:val="auto"/>
         </w:rPr>
-        <w:t>3</w:t>
-      </w:r>
+      </w:pPr>
       <w:r>
         <w:rPr>
           <w:rFonts w:ascii="Arial" w:hAnsi="Arial" w:cs="Arial"/>
           <w:color w:val="auto"/>
         </w:rPr>
-        <w:t>. Implementation Details</w:t>
+        <w:t>3. Implementation Details</w:t>
       </w:r>
     </w:p>
     <w:p>
@@ -1270,14 +1315,7 @@
           <w:rStyle w:val="citation-72"/>
           <w:rFonts w:ascii="Arial" w:hAnsi="Arial" w:cs="Arial"/>
         </w:rPr>
-        <w:t xml:space="preserve"> Pomodoro ve manuel süre tutma mantığı kodlanmış olup, ar</w:t>
-      </w:r>
-      <w:r>
-        <w:rPr>
-          <w:rStyle w:val="citation-72"/>
-          <w:rFonts w:ascii="Arial" w:hAnsi="Arial" w:cs="Arial"/>
-        </w:rPr>
-        <w:t>ka planda zamanlayıcılar çalışır</w:t>
+        <w:t xml:space="preserve"> Pomodoro ve manuel süre tutma mantığı kodlanmış olup, arka planda zamanlayıcılar çalışır</w:t>
       </w:r>
       <w:r>
         <w:rPr>
@@ -1345,14 +1383,7 @@
           <w:rStyle w:val="citation-70"/>
           <w:rFonts w:ascii="Arial" w:hAnsi="Arial" w:cs="Arial"/>
         </w:rPr>
-        <w:t xml:space="preserve"> Kullanıcının hangi derse veya konuya ne kadar zaman ayırdığı ve</w:t>
-      </w:r>
-      <w:r>
-        <w:rPr>
-          <w:rStyle w:val="citation-70"/>
-          <w:rFonts w:ascii="Arial" w:hAnsi="Arial" w:cs="Arial"/>
-        </w:rPr>
-        <w:t>ritabanından çekilir ve işlenir</w:t>
+        <w:t xml:space="preserve"> Kullanıcının hangi derse veya konuya ne kadar zaman ayırdığı veritabanından çekilir ve işlenir</w:t>
       </w:r>
       <w:r>
         <w:rPr>
@@ -1363,615 +1394,1116 @@
     </w:p>
     <w:p>
       <w:pPr>
-        <w:spacing w:before="100" w:beforeAutospacing="1" w:after="100" w:afterAutospacing="1" w:line="240" w:lineRule="auto"/>
-        <w:rPr>
-          <w:rFonts w:ascii="Arial" w:eastAsia="Times New Roman" w:hAnsi="Arial" w:cs="Arial"/>
-          <w:kern w:val="0"/>
-          <w:lang w:val="tr-TR" w:eastAsia="tr-TR"/>
-          <w14:ligatures w14:val="none"/>
-        </w:rPr>
-      </w:pPr>
-      <w:r>
-        <w:rPr>
-          <w:rFonts w:ascii="Arial" w:eastAsia="Times New Roman" w:hAnsi="Arial" w:cs="Arial"/>
+        <w:pStyle w:val="NormalWeb"/>
+        <w:spacing w:before="0" w:beforeAutospacing="0" w:after="240" w:afterAutospacing="0"/>
+        <w:rPr>
+          <w:rFonts w:ascii="Arial" w:hAnsi="Arial" w:cs="Arial"/>
+          <w:color w:val="000000" w:themeColor="text1"/>
+        </w:rPr>
+      </w:pPr>
+      <w:r>
+        <w:rPr>
+          <w:rFonts w:ascii="Arial" w:hAnsi="Arial" w:cs="Arial"/>
           <w:b/>
           <w:bCs/>
-          <w:kern w:val="0"/>
-          <w:lang w:val="tr-TR" w:eastAsia="tr-TR"/>
-          <w14:ligatures w14:val="none"/>
+          <w:color w:val="000000" w:themeColor="text1"/>
         </w:rPr>
         <w:lastRenderedPageBreak/>
         <w:t>Component Interfaces:</w:t>
       </w:r>
       <w:r>
         <w:rPr>
-          <w:rFonts w:ascii="Arial" w:eastAsia="Times New Roman" w:hAnsi="Arial" w:cs="Arial"/>
-          <w:kern w:val="0"/>
-          <w:lang w:val="tr-TR" w:eastAsia="tr-TR"/>
-          <w14:ligatures w14:val="none"/>
-        </w:rPr>
-        <w:t xml:space="preserve"> Projenin modülerliğini ve test edilebilirliğini artırmak için katmanlar arası iletişim doğrudan sınıflarla değil, arayüzler (interfaces) üzerinden sağlanmaktadır. Temel bileşen arayüzleri şunlardır:</w:t>
+          <w:rFonts w:ascii="Arial" w:hAnsi="Arial" w:cs="Arial"/>
+          <w:color w:val="000000" w:themeColor="text1"/>
+        </w:rPr>
+        <w:t xml:space="preserve"> </w:t>
+      </w:r>
+      <w:r>
+        <w:rPr>
+          <w:rFonts w:ascii="Arial" w:hAnsi="Arial" w:cs="Arial"/>
+          <w:color w:val="000000" w:themeColor="text1"/>
+        </w:rPr>
+        <w:t>Projenin modülerliğini ve test edilebilirliğini artırmak için katmanlar arası iletişim arayüzler üzerinden sağlanmaktadır. Temel bileşen arayüzleri şunlardır:</w:t>
+      </w:r>
+    </w:p>
+    <w:p>
+      <w:pPr>
+        <w:pStyle w:val="Balk3"/>
+        <w:spacing w:before="360" w:after="210"/>
+        <w:rPr>
+          <w:rFonts w:ascii="Arial" w:hAnsi="Arial" w:cs="Arial"/>
+          <w:color w:val="000000" w:themeColor="text1"/>
+          <w:sz w:val="24"/>
+          <w:szCs w:val="24"/>
+        </w:rPr>
+      </w:pPr>
+      <w:r>
+        <w:rPr>
+          <w:rFonts w:ascii="Arial" w:hAnsi="Arial" w:cs="Arial"/>
+          <w:color w:val="000000" w:themeColor="text1"/>
+          <w:sz w:val="24"/>
+          <w:szCs w:val="24"/>
+        </w:rPr>
+        <w:t>Veri Erişim Arayüzleri (Data Access - DAO):</w:t>
+      </w:r>
+    </w:p>
+    <w:p>
+      <w:pPr>
+        <w:pStyle w:val="NormalWeb"/>
+        <w:spacing w:before="0" w:beforeAutospacing="0" w:after="240" w:afterAutospacing="0"/>
+        <w:rPr>
+          <w:rFonts w:ascii="Arial" w:hAnsi="Arial" w:cs="Arial"/>
+          <w:color w:val="000000" w:themeColor="text1"/>
+        </w:rPr>
+      </w:pPr>
+      <w:r>
+        <w:rPr>
+          <w:rFonts w:ascii="Arial" w:hAnsi="Arial" w:cs="Arial"/>
+          <w:color w:val="000000" w:themeColor="text1"/>
+        </w:rPr>
+        <w:t>Veritabanı işlemlerini yöneten sınıflar. Singleton örüntüsü ile tek bağlantı noktası sağlanır.</w:t>
       </w:r>
     </w:p>
     <w:p>
       <w:pPr>
         <w:numPr>
           <w:ilvl w:val="0"/>
-          <w:numId w:val="7"/>
+          <w:numId w:val="9"/>
         </w:numPr>
-        <w:spacing w:before="100" w:beforeAutospacing="1" w:after="100" w:afterAutospacing="1" w:line="240" w:lineRule="auto"/>
-        <w:rPr>
-          <w:rFonts w:ascii="Arial" w:eastAsia="Times New Roman" w:hAnsi="Arial" w:cs="Arial"/>
-          <w:kern w:val="0"/>
-          <w:lang w:val="tr-TR" w:eastAsia="tr-TR"/>
-          <w14:ligatures w14:val="none"/>
-        </w:rPr>
-      </w:pPr>
-      <w:r>
-        <w:rPr>
-          <w:rFonts w:ascii="Arial" w:eastAsia="Times New Roman" w:hAnsi="Arial" w:cs="Arial"/>
+        <w:spacing w:before="60" w:after="60" w:line="240" w:lineRule="auto"/>
+        <w:rPr>
+          <w:rFonts w:ascii="Arial" w:hAnsi="Arial" w:cs="Arial"/>
+          <w:color w:val="000000" w:themeColor="text1"/>
+          <w:sz w:val="20"/>
+          <w:szCs w:val="20"/>
+        </w:rPr>
+      </w:pPr>
+      <w:r>
+        <w:rPr>
+          <w:rStyle w:val="Gl"/>
+          <w:rFonts w:ascii="Arial" w:hAnsi="Arial" w:cs="Arial"/>
+          <w:color w:val="000000" w:themeColor="text1"/>
+          <w:sz w:val="20"/>
+          <w:szCs w:val="20"/>
+        </w:rPr>
+        <w:t>CourseDAO</w:t>
+      </w:r>
+      <w:r>
+        <w:rPr>
+          <w:rFonts w:ascii="Arial" w:hAnsi="Arial" w:cs="Arial"/>
+          <w:color w:val="000000" w:themeColor="text1"/>
+          <w:sz w:val="20"/>
+          <w:szCs w:val="20"/>
+        </w:rPr>
+        <w:t>: Ders CRUD işlemleri.</w:t>
+      </w:r>
+    </w:p>
+    <w:p>
+      <w:pPr>
+        <w:pStyle w:val="ListeParagraf"/>
+        <w:numPr>
+          <w:ilvl w:val="1"/>
+          <w:numId w:val="9"/>
+        </w:numPr>
+        <w:rPr>
+          <w:rFonts w:ascii="Arial" w:hAnsi="Arial" w:cs="Arial"/>
+          <w:color w:val="000000" w:themeColor="text1"/>
+          <w:sz w:val="20"/>
+          <w:szCs w:val="20"/>
+        </w:rPr>
+      </w:pPr>
+      <w:r>
+        <w:rPr>
+          <w:rFonts w:ascii="Arial" w:hAnsi="Arial" w:cs="Arial"/>
+          <w:color w:val="000000" w:themeColor="text1"/>
+          <w:sz w:val="20"/>
+          <w:szCs w:val="20"/>
+        </w:rPr>
+        <w:t>Önemli Metotlar: </w:t>
+      </w:r>
+      <w:r>
+        <w:rPr>
+          <w:rFonts w:ascii="Arial" w:hAnsi="Arial" w:cs="Arial"/>
+          <w:color w:val="000000" w:themeColor="text1"/>
+          <w:sz w:val="20"/>
+          <w:szCs w:val="20"/>
+        </w:rPr>
+        <w:t>List&lt;Course&gt; getAll(), void save(Course), void delete(int).</w:t>
+      </w:r>
+    </w:p>
+    <w:p>
+      <w:pPr>
+        <w:numPr>
+          <w:ilvl w:val="0"/>
+          <w:numId w:val="9"/>
+        </w:numPr>
+        <w:spacing w:before="60" w:after="60" w:line="240" w:lineRule="auto"/>
+        <w:rPr>
+          <w:rFonts w:ascii="Arial" w:hAnsi="Arial" w:cs="Arial"/>
+          <w:color w:val="000000" w:themeColor="text1"/>
+          <w:sz w:val="20"/>
+          <w:szCs w:val="20"/>
+        </w:rPr>
+      </w:pPr>
+      <w:r>
+        <w:rPr>
+          <w:rStyle w:val="Gl"/>
+          <w:rFonts w:ascii="Arial" w:hAnsi="Arial" w:cs="Arial"/>
+          <w:color w:val="000000" w:themeColor="text1"/>
+          <w:sz w:val="20"/>
+          <w:szCs w:val="20"/>
+        </w:rPr>
+        <w:t>EventDAO</w:t>
+      </w:r>
+      <w:r>
+        <w:rPr>
+          <w:rFonts w:ascii="Arial" w:hAnsi="Arial" w:cs="Arial"/>
+          <w:color w:val="000000" w:themeColor="text1"/>
+          <w:sz w:val="20"/>
+          <w:szCs w:val="20"/>
+        </w:rPr>
+        <w:t>: Etkinlik CRUD işlemleri.</w:t>
+      </w:r>
+    </w:p>
+    <w:p>
+      <w:pPr>
+        <w:numPr>
+          <w:ilvl w:val="1"/>
+          <w:numId w:val="9"/>
+        </w:numPr>
+        <w:spacing w:before="60" w:after="60" w:line="240" w:lineRule="auto"/>
+        <w:rPr>
+          <w:rFonts w:ascii="Arial" w:hAnsi="Arial" w:cs="Arial"/>
+          <w:color w:val="000000" w:themeColor="text1"/>
+          <w:sz w:val="20"/>
+          <w:szCs w:val="20"/>
+        </w:rPr>
+      </w:pPr>
+      <w:r>
+        <w:rPr>
+          <w:rFonts w:ascii="Arial" w:hAnsi="Arial" w:cs="Arial"/>
+          <w:color w:val="000000" w:themeColor="text1"/>
+          <w:sz w:val="20"/>
+          <w:szCs w:val="20"/>
+        </w:rPr>
+        <w:t>Önemli Metotlar: </w:t>
+      </w:r>
+      <w:r>
+        <w:rPr>
+          <w:rFonts w:ascii="Arial" w:hAnsi="Arial" w:cs="Arial"/>
+          <w:color w:val="000000" w:themeColor="text1"/>
+          <w:sz w:val="20"/>
+          <w:szCs w:val="20"/>
+        </w:rPr>
+        <w:t>List&lt;Event&gt; getAll(), void save(Event).</w:t>
+      </w:r>
+    </w:p>
+    <w:p>
+      <w:pPr>
+        <w:numPr>
+          <w:ilvl w:val="0"/>
+          <w:numId w:val="9"/>
+        </w:numPr>
+        <w:spacing w:before="60" w:after="60" w:line="240" w:lineRule="auto"/>
+        <w:rPr>
+          <w:rFonts w:ascii="Arial" w:hAnsi="Arial" w:cs="Arial"/>
+          <w:color w:val="000000" w:themeColor="text1"/>
+          <w:sz w:val="20"/>
+          <w:szCs w:val="20"/>
+        </w:rPr>
+      </w:pPr>
+      <w:r>
+        <w:rPr>
+          <w:rStyle w:val="Gl"/>
+          <w:rFonts w:ascii="Arial" w:hAnsi="Arial" w:cs="Arial"/>
+          <w:color w:val="000000" w:themeColor="text1"/>
+          <w:sz w:val="20"/>
+          <w:szCs w:val="20"/>
+        </w:rPr>
+        <w:t>TodoItemDAO</w:t>
+      </w:r>
+      <w:r>
+        <w:rPr>
+          <w:rFonts w:ascii="Arial" w:hAnsi="Arial" w:cs="Arial"/>
+          <w:color w:val="000000" w:themeColor="text1"/>
+          <w:sz w:val="20"/>
+          <w:szCs w:val="20"/>
+        </w:rPr>
+        <w:t>: Görev CRUD işlemleri.</w:t>
+      </w:r>
+    </w:p>
+    <w:p>
+      <w:pPr>
+        <w:numPr>
+          <w:ilvl w:val="1"/>
+          <w:numId w:val="9"/>
+        </w:numPr>
+        <w:spacing w:before="60" w:after="60" w:line="240" w:lineRule="auto"/>
+        <w:rPr>
+          <w:rFonts w:ascii="Arial" w:hAnsi="Arial" w:cs="Arial"/>
+          <w:color w:val="000000" w:themeColor="text1"/>
+          <w:sz w:val="20"/>
+          <w:szCs w:val="20"/>
+        </w:rPr>
+      </w:pPr>
+      <w:r>
+        <w:rPr>
+          <w:rFonts w:ascii="Arial" w:hAnsi="Arial" w:cs="Arial"/>
+          <w:color w:val="000000" w:themeColor="text1"/>
+          <w:sz w:val="20"/>
+          <w:szCs w:val="20"/>
+        </w:rPr>
+        <w:t>Önemli Metotlar: </w:t>
+      </w:r>
+      <w:r>
+        <w:rPr>
+          <w:rFonts w:ascii="Arial" w:hAnsi="Arial" w:cs="Arial"/>
+          <w:color w:val="000000" w:themeColor="text1"/>
+          <w:sz w:val="20"/>
+          <w:szCs w:val="20"/>
+        </w:rPr>
+        <w:t>List&lt;TodoItem&gt; getAll(), void save(TodoItem), void update(TodoItem).</w:t>
+      </w:r>
+    </w:p>
+    <w:p>
+      <w:pPr>
+        <w:numPr>
+          <w:ilvl w:val="0"/>
+          <w:numId w:val="9"/>
+        </w:numPr>
+        <w:spacing w:before="60" w:after="60" w:line="240" w:lineRule="auto"/>
+        <w:rPr>
+          <w:rFonts w:ascii="Arial" w:hAnsi="Arial" w:cs="Arial"/>
+          <w:color w:val="000000" w:themeColor="text1"/>
+          <w:sz w:val="20"/>
+          <w:szCs w:val="20"/>
+        </w:rPr>
+      </w:pPr>
+      <w:r>
+        <w:rPr>
+          <w:rStyle w:val="Gl"/>
+          <w:rFonts w:ascii="Arial" w:hAnsi="Arial" w:cs="Arial"/>
+          <w:color w:val="000000" w:themeColor="text1"/>
+          <w:sz w:val="20"/>
+          <w:szCs w:val="20"/>
+        </w:rPr>
+        <w:t>StudySessionDAO</w:t>
+      </w:r>
+      <w:r>
+        <w:rPr>
+          <w:rFonts w:ascii="Arial" w:hAnsi="Arial" w:cs="Arial"/>
+          <w:color w:val="000000" w:themeColor="text1"/>
+          <w:sz w:val="20"/>
+          <w:szCs w:val="20"/>
+        </w:rPr>
+        <w:t>: Çalışma oturumu işlemleri.</w:t>
+      </w:r>
+    </w:p>
+    <w:p>
+      <w:pPr>
+        <w:numPr>
+          <w:ilvl w:val="1"/>
+          <w:numId w:val="9"/>
+        </w:numPr>
+        <w:spacing w:before="60" w:after="60" w:line="240" w:lineRule="auto"/>
+        <w:rPr>
+          <w:rFonts w:ascii="Arial" w:hAnsi="Arial" w:cs="Arial"/>
+          <w:color w:val="000000" w:themeColor="text1"/>
+          <w:sz w:val="20"/>
+          <w:szCs w:val="20"/>
+        </w:rPr>
+      </w:pPr>
+      <w:r>
+        <w:rPr>
+          <w:rFonts w:ascii="Arial" w:hAnsi="Arial" w:cs="Arial"/>
+          <w:color w:val="000000" w:themeColor="text1"/>
+          <w:sz w:val="20"/>
+          <w:szCs w:val="20"/>
+        </w:rPr>
+        <w:t>Önemli Metotlar: </w:t>
+      </w:r>
+      <w:r>
+        <w:rPr>
+          <w:rFonts w:ascii="Arial" w:hAnsi="Arial" w:cs="Arial"/>
+          <w:color w:val="000000" w:themeColor="text1"/>
+          <w:sz w:val="20"/>
+          <w:szCs w:val="20"/>
+        </w:rPr>
+        <w:t>void save(StudySession), List&lt;StudySession&gt; getByUserId(int), int getTotalMinutes(int).</w:t>
+      </w:r>
+    </w:p>
+    <w:p>
+      <w:pPr>
+        <w:numPr>
+          <w:ilvl w:val="0"/>
+          <w:numId w:val="9"/>
+        </w:numPr>
+        <w:spacing w:before="60" w:after="60" w:line="240" w:lineRule="auto"/>
+        <w:rPr>
+          <w:rFonts w:ascii="Arial" w:hAnsi="Arial" w:cs="Arial"/>
+          <w:color w:val="000000" w:themeColor="text1"/>
+          <w:sz w:val="20"/>
+          <w:szCs w:val="20"/>
+        </w:rPr>
+      </w:pPr>
+      <w:r>
+        <w:rPr>
+          <w:rStyle w:val="Gl"/>
+          <w:rFonts w:ascii="Arial" w:hAnsi="Arial" w:cs="Arial"/>
+          <w:color w:val="000000" w:themeColor="text1"/>
+          <w:sz w:val="20"/>
+          <w:szCs w:val="20"/>
+        </w:rPr>
+        <w:t>DatabaseConnection (Singleton)</w:t>
+      </w:r>
+      <w:r>
+        <w:rPr>
+          <w:rFonts w:ascii="Arial" w:hAnsi="Arial" w:cs="Arial"/>
+          <w:color w:val="000000" w:themeColor="text1"/>
+          <w:sz w:val="20"/>
+          <w:szCs w:val="20"/>
+        </w:rPr>
+        <w:t>: Bağlantı yönetimi.</w:t>
+      </w:r>
+    </w:p>
+    <w:p>
+      <w:pPr>
+        <w:numPr>
+          <w:ilvl w:val="1"/>
+          <w:numId w:val="9"/>
+        </w:numPr>
+        <w:spacing w:after="0" w:line="240" w:lineRule="auto"/>
+        <w:rPr>
+          <w:rFonts w:ascii="Arial" w:hAnsi="Arial" w:cs="Arial"/>
+          <w:color w:val="000000" w:themeColor="text1"/>
+          <w:sz w:val="20"/>
+          <w:szCs w:val="20"/>
+        </w:rPr>
+      </w:pPr>
+      <w:r>
+        <w:rPr>
+          <w:rFonts w:ascii="Arial" w:hAnsi="Arial" w:cs="Arial"/>
+          <w:color w:val="000000" w:themeColor="text1"/>
+          <w:sz w:val="20"/>
+          <w:szCs w:val="20"/>
+        </w:rPr>
+        <w:t>Önemli Metotlar: </w:t>
+      </w:r>
+      <w:r>
+        <w:rPr>
+          <w:rFonts w:ascii="Arial" w:hAnsi="Arial" w:cs="Arial"/>
+          <w:color w:val="000000" w:themeColor="text1"/>
+          <w:sz w:val="20"/>
+          <w:szCs w:val="20"/>
+        </w:rPr>
+        <w:t>DatabaseConnection getInstance(), void initializeDatabase().</w:t>
+      </w:r>
+    </w:p>
+    <w:p>
+      <w:pPr>
+        <w:pStyle w:val="Balk3"/>
+        <w:spacing w:before="360" w:after="210"/>
+        <w:rPr>
+          <w:rFonts w:ascii="Arial" w:hAnsi="Arial" w:cs="Arial"/>
+          <w:color w:val="000000" w:themeColor="text1"/>
+          <w:sz w:val="24"/>
+          <w:szCs w:val="24"/>
+        </w:rPr>
+      </w:pPr>
+      <w:r>
+        <w:rPr>
+          <w:rFonts w:ascii="Arial" w:hAnsi="Arial" w:cs="Arial"/>
+          <w:color w:val="000000" w:themeColor="text1"/>
+          <w:sz w:val="24"/>
+          <w:szCs w:val="24"/>
+        </w:rPr>
+        <w:t>İş Mantığı Arayüzleri (Business Service):</w:t>
+      </w:r>
+    </w:p>
+    <w:p>
+      <w:pPr>
+        <w:pStyle w:val="NormalWeb"/>
+        <w:spacing w:before="0" w:beforeAutospacing="0" w:after="240" w:afterAutospacing="0"/>
+        <w:rPr>
+          <w:rFonts w:ascii="Arial" w:hAnsi="Arial" w:cs="Arial"/>
+          <w:color w:val="000000" w:themeColor="text1"/>
+        </w:rPr>
+      </w:pPr>
+      <w:r>
+        <w:rPr>
+          <w:rFonts w:ascii="Arial" w:hAnsi="Arial" w:cs="Arial"/>
+          <w:color w:val="000000" w:themeColor="text1"/>
+        </w:rPr>
+        <w:t>İş kurallarını uygulayan sınıflar. Observer örüntüsü ile olay bildirimleri yapılır.</w:t>
+      </w:r>
+    </w:p>
+    <w:p>
+      <w:pPr>
+        <w:numPr>
+          <w:ilvl w:val="0"/>
+          <w:numId w:val="10"/>
+        </w:numPr>
+        <w:spacing w:before="60" w:after="60" w:line="240" w:lineRule="auto"/>
+        <w:rPr>
+          <w:rFonts w:ascii="Arial" w:hAnsi="Arial" w:cs="Arial"/>
+          <w:color w:val="000000" w:themeColor="text1"/>
+          <w:sz w:val="20"/>
+          <w:szCs w:val="20"/>
+        </w:rPr>
+      </w:pPr>
+      <w:r>
+        <w:rPr>
+          <w:rStyle w:val="Gl"/>
+          <w:rFonts w:ascii="Arial" w:hAnsi="Arial" w:cs="Arial"/>
+          <w:color w:val="000000" w:themeColor="text1"/>
+          <w:sz w:val="20"/>
+          <w:szCs w:val="20"/>
+        </w:rPr>
+        <w:t>CourseService</w:t>
+      </w:r>
+      <w:r>
+        <w:rPr>
+          <w:rFonts w:ascii="Arial" w:hAnsi="Arial" w:cs="Arial"/>
+          <w:color w:val="000000" w:themeColor="text1"/>
+          <w:sz w:val="20"/>
+          <w:szCs w:val="20"/>
+        </w:rPr>
+        <w:t>: Ders yönetimi.</w:t>
+      </w:r>
+    </w:p>
+    <w:p>
+      <w:pPr>
+        <w:numPr>
+          <w:ilvl w:val="1"/>
+          <w:numId w:val="10"/>
+        </w:numPr>
+        <w:spacing w:after="0" w:line="240" w:lineRule="auto"/>
+        <w:rPr>
+          <w:rFonts w:ascii="Arial" w:hAnsi="Arial" w:cs="Arial"/>
+          <w:color w:val="000000" w:themeColor="text1"/>
+          <w:sz w:val="20"/>
+          <w:szCs w:val="20"/>
+        </w:rPr>
+      </w:pPr>
+      <w:r>
+        <w:rPr>
+          <w:rFonts w:ascii="Arial" w:hAnsi="Arial" w:cs="Arial"/>
+          <w:color w:val="000000" w:themeColor="text1"/>
+          <w:sz w:val="20"/>
+          <w:szCs w:val="20"/>
+        </w:rPr>
+        <w:t>Önemli Metotlar: </w:t>
+      </w:r>
+      <w:r>
+        <w:rPr>
+          <w:rFonts w:ascii="Arial" w:hAnsi="Arial" w:cs="Arial"/>
+          <w:color w:val="000000" w:themeColor="text1"/>
+          <w:sz w:val="20"/>
+          <w:szCs w:val="20"/>
+        </w:rPr>
+        <w:t>void addCourse(Course), List&lt;Course&gt; getCourses(int).</w:t>
+      </w:r>
+    </w:p>
+    <w:p>
+      <w:pPr>
+        <w:numPr>
+          <w:ilvl w:val="0"/>
+          <w:numId w:val="10"/>
+        </w:numPr>
+        <w:spacing w:before="60" w:after="60" w:line="240" w:lineRule="auto"/>
+        <w:rPr>
+          <w:rFonts w:ascii="Arial" w:hAnsi="Arial" w:cs="Arial"/>
+          <w:color w:val="000000" w:themeColor="text1"/>
+          <w:sz w:val="20"/>
+          <w:szCs w:val="20"/>
+        </w:rPr>
+      </w:pPr>
+      <w:r>
+        <w:rPr>
+          <w:rStyle w:val="Gl"/>
+          <w:rFonts w:ascii="Arial" w:hAnsi="Arial" w:cs="Arial"/>
+          <w:color w:val="000000" w:themeColor="text1"/>
+          <w:sz w:val="20"/>
+          <w:szCs w:val="20"/>
+        </w:rPr>
+        <w:t>TodoService</w:t>
+      </w:r>
+      <w:r>
+        <w:rPr>
+          <w:rFonts w:ascii="Arial" w:hAnsi="Arial" w:cs="Arial"/>
+          <w:color w:val="000000" w:themeColor="text1"/>
+          <w:sz w:val="20"/>
+          <w:szCs w:val="20"/>
+        </w:rPr>
+        <w:t>: Görev yönetimi.</w:t>
+      </w:r>
+    </w:p>
+    <w:p>
+      <w:pPr>
+        <w:numPr>
+          <w:ilvl w:val="1"/>
+          <w:numId w:val="10"/>
+        </w:numPr>
+        <w:spacing w:before="60" w:after="60" w:line="240" w:lineRule="auto"/>
+        <w:rPr>
+          <w:rFonts w:ascii="Arial" w:hAnsi="Arial" w:cs="Arial"/>
+          <w:color w:val="000000" w:themeColor="text1"/>
+          <w:sz w:val="20"/>
+          <w:szCs w:val="20"/>
+        </w:rPr>
+      </w:pPr>
+      <w:r>
+        <w:rPr>
+          <w:rFonts w:ascii="Arial" w:hAnsi="Arial" w:cs="Arial"/>
+          <w:color w:val="000000" w:themeColor="text1"/>
+          <w:sz w:val="20"/>
+          <w:szCs w:val="20"/>
+        </w:rPr>
+        <w:t>Önemli Metotlar: </w:t>
+      </w:r>
+      <w:r>
+        <w:rPr>
+          <w:rFonts w:ascii="Arial" w:hAnsi="Arial" w:cs="Arial"/>
+          <w:color w:val="000000" w:themeColor="text1"/>
+          <w:sz w:val="20"/>
+          <w:szCs w:val="20"/>
+        </w:rPr>
+        <w:t>void addTodo(TodoItem), void markCompleted(int).</w:t>
+      </w:r>
+    </w:p>
+    <w:p>
+      <w:pPr>
+        <w:numPr>
+          <w:ilvl w:val="0"/>
+          <w:numId w:val="10"/>
+        </w:numPr>
+        <w:spacing w:before="60" w:after="60" w:line="240" w:lineRule="auto"/>
+        <w:rPr>
+          <w:rFonts w:ascii="Arial" w:hAnsi="Arial" w:cs="Arial"/>
+          <w:color w:val="000000" w:themeColor="text1"/>
+          <w:sz w:val="20"/>
+          <w:szCs w:val="20"/>
+        </w:rPr>
+      </w:pPr>
+      <w:r>
+        <w:rPr>
+          <w:rStyle w:val="Gl"/>
+          <w:rFonts w:ascii="Arial" w:hAnsi="Arial" w:cs="Arial"/>
+          <w:color w:val="000000" w:themeColor="text1"/>
+          <w:sz w:val="20"/>
+          <w:szCs w:val="20"/>
+        </w:rPr>
+        <w:t>PomodoroTimer (Observer Subject)</w:t>
+      </w:r>
+      <w:r>
+        <w:rPr>
+          <w:rFonts w:ascii="Arial" w:hAnsi="Arial" w:cs="Arial"/>
+          <w:color w:val="000000" w:themeColor="text1"/>
+          <w:sz w:val="20"/>
+          <w:szCs w:val="20"/>
+        </w:rPr>
+        <w:t>: Zamanlayıcı kontrolü.</w:t>
+      </w:r>
+    </w:p>
+    <w:p>
+      <w:pPr>
+        <w:numPr>
+          <w:ilvl w:val="1"/>
+          <w:numId w:val="10"/>
+        </w:numPr>
+        <w:spacing w:after="0" w:line="240" w:lineRule="auto"/>
+        <w:rPr>
+          <w:rFonts w:ascii="Arial" w:hAnsi="Arial" w:cs="Arial"/>
+          <w:color w:val="000000" w:themeColor="text1"/>
+          <w:sz w:val="20"/>
+          <w:szCs w:val="20"/>
+        </w:rPr>
+      </w:pPr>
+      <w:r>
+        <w:rPr>
+          <w:rFonts w:ascii="Arial" w:hAnsi="Arial" w:cs="Arial"/>
+          <w:color w:val="000000" w:themeColor="text1"/>
+          <w:sz w:val="20"/>
+          <w:szCs w:val="20"/>
+        </w:rPr>
+        <w:t>Önemli Metotlar: </w:t>
+      </w:r>
+      <w:r>
+        <w:rPr>
+          <w:rFonts w:ascii="Arial" w:hAnsi="Arial" w:cs="Arial"/>
+          <w:color w:val="000000" w:themeColor="text1"/>
+          <w:sz w:val="20"/>
+          <w:szCs w:val="20"/>
+        </w:rPr>
+        <w:t>void start(), void pause(), void register(Observer).</w:t>
+      </w:r>
+    </w:p>
+    <w:p>
+      <w:pPr>
+        <w:numPr>
+          <w:ilvl w:val="0"/>
+          <w:numId w:val="10"/>
+        </w:numPr>
+        <w:spacing w:before="60" w:after="60" w:line="240" w:lineRule="auto"/>
+        <w:rPr>
+          <w:rFonts w:ascii="Arial" w:hAnsi="Arial" w:cs="Arial"/>
+          <w:color w:val="000000" w:themeColor="text1"/>
+          <w:sz w:val="20"/>
+          <w:szCs w:val="20"/>
+        </w:rPr>
+      </w:pPr>
+      <w:r>
+        <w:rPr>
+          <w:rStyle w:val="Gl"/>
+          <w:rFonts w:ascii="Arial" w:hAnsi="Arial" w:cs="Arial"/>
+          <w:color w:val="000000" w:themeColor="text1"/>
+          <w:sz w:val="20"/>
+          <w:szCs w:val="20"/>
+        </w:rPr>
+        <w:t>StatisticsService</w:t>
+      </w:r>
+      <w:r>
+        <w:rPr>
+          <w:rFonts w:ascii="Arial" w:hAnsi="Arial" w:cs="Arial"/>
+          <w:color w:val="000000" w:themeColor="text1"/>
+          <w:sz w:val="20"/>
+          <w:szCs w:val="20"/>
+        </w:rPr>
+        <w:t>: İstatistik hesaplama.</w:t>
+      </w:r>
+    </w:p>
+    <w:p>
+      <w:pPr>
+        <w:numPr>
+          <w:ilvl w:val="1"/>
+          <w:numId w:val="10"/>
+        </w:numPr>
+        <w:spacing w:before="60" w:after="60" w:line="240" w:lineRule="auto"/>
+        <w:rPr>
+          <w:rFonts w:ascii="Arial" w:hAnsi="Arial" w:cs="Arial"/>
+          <w:color w:val="000000" w:themeColor="text1"/>
+          <w:sz w:val="20"/>
+          <w:szCs w:val="20"/>
+        </w:rPr>
+      </w:pPr>
+      <w:r>
+        <w:rPr>
+          <w:rFonts w:ascii="Arial" w:hAnsi="Arial" w:cs="Arial"/>
+          <w:color w:val="000000" w:themeColor="text1"/>
+          <w:sz w:val="20"/>
+          <w:szCs w:val="20"/>
+        </w:rPr>
+        <w:t>Önemli Metotlar: </w:t>
+      </w:r>
+      <w:r>
+        <w:rPr>
+          <w:rFonts w:ascii="Arial" w:hAnsi="Arial" w:cs="Arial"/>
+          <w:color w:val="000000" w:themeColor="text1"/>
+          <w:sz w:val="20"/>
+          <w:szCs w:val="20"/>
+        </w:rPr>
+        <w:t>int getTotalStudyTime(int), Map&lt;String, Object&gt; getStudyStats().</w:t>
+      </w:r>
+    </w:p>
+    <w:p>
+      <w:pPr>
+        <w:spacing w:before="60" w:after="60" w:line="240" w:lineRule="auto"/>
+        <w:rPr>
+          <w:rFonts w:ascii="Arial" w:hAnsi="Arial" w:cs="Arial"/>
+          <w:color w:val="000000" w:themeColor="text1"/>
+          <w:sz w:val="20"/>
+          <w:szCs w:val="20"/>
+        </w:rPr>
+      </w:pPr>
+    </w:p>
+    <w:p>
+      <w:pPr>
+        <w:spacing w:before="60" w:after="60" w:line="240" w:lineRule="auto"/>
+        <w:rPr>
+          <w:rFonts w:ascii="Arial" w:hAnsi="Arial" w:cs="Arial"/>
+          <w:color w:val="000000" w:themeColor="text1"/>
+          <w:sz w:val="20"/>
+          <w:szCs w:val="20"/>
+        </w:rPr>
+      </w:pPr>
+    </w:p>
+    <w:p>
+      <w:pPr>
+        <w:pStyle w:val="NormalWeb"/>
+        <w:rPr>
+          <w:rFonts w:ascii="Arial" w:hAnsi="Arial" w:cs="Arial"/>
+        </w:rPr>
+      </w:pPr>
+      <w:r>
+        <w:rPr>
+          <w:rFonts w:ascii="Arial" w:hAnsi="Arial" w:cs="Arial"/>
           <w:b/>
           <w:bCs/>
-          <w:kern w:val="0"/>
-          <w:lang w:val="tr-TR" w:eastAsia="tr-TR"/>
-          <w14:ligatures w14:val="none"/>
-        </w:rPr>
-        <w:t>Veri Erişim Arayüzleri (Data Access - DAO):</w:t>
-      </w:r>
-    </w:p>
-    <w:p>
-      <w:pPr>
-        <w:numPr>
-          <w:ilvl w:val="1"/>
-          <w:numId w:val="7"/>
-        </w:numPr>
-        <w:spacing w:before="100" w:beforeAutospacing="1" w:after="100" w:afterAutospacing="1" w:line="240" w:lineRule="auto"/>
-        <w:rPr>
-          <w:rFonts w:ascii="Arial" w:eastAsia="Times New Roman" w:hAnsi="Arial" w:cs="Arial"/>
-          <w:kern w:val="0"/>
-          <w:lang w:val="tr-TR" w:eastAsia="tr-TR"/>
-          <w14:ligatures w14:val="none"/>
-        </w:rPr>
-      </w:pPr>
-      <w:r>
-        <w:rPr>
-          <w:rFonts w:ascii="Arial" w:eastAsia="Times New Roman" w:hAnsi="Arial" w:cs="Arial"/>
+        </w:rPr>
+        <w:t>Visual Interfaces:</w:t>
+      </w:r>
+      <w:r>
+        <w:rPr>
+          <w:rFonts w:ascii="Arial" w:hAnsi="Arial" w:cs="Arial"/>
+        </w:rPr>
+        <w:t xml:space="preserve"> </w:t>
+      </w:r>
+      <w:r>
+        <w:rPr>
+          <w:rStyle w:val="citation-67"/>
+          <w:rFonts w:ascii="Arial" w:hAnsi="Arial" w:cs="Arial"/>
+        </w:rPr>
+        <w:t>Sistem, JavaFX kullanılarak tasarlanmış interaktif bir Dashboard, haftalık programın görüldüğü Takvim ekranı ve verilerin pasta/çubuk grafiklerle sunulduğu İstatistik panelinden oluşmaktadır</w:t>
+      </w:r>
+      <w:r>
+        <w:rPr>
+          <w:rFonts w:ascii="Arial" w:hAnsi="Arial" w:cs="Arial"/>
+        </w:rPr>
+        <w:t xml:space="preserve">. </w:t>
+      </w:r>
+      <w:r>
+        <w:rPr>
+          <w:rStyle w:val="citation-66"/>
+          <w:rFonts w:ascii="Arial" w:hAnsi="Arial" w:cs="Arial"/>
+        </w:rPr>
+        <w:t xml:space="preserve">(Projenin GitHub deposunda UI tasarımlarını gösteren wireframe ve ekran görüntüleri UI_Screenshots klasörü altında bulunacaktır </w:t>
+      </w:r>
+      <w:r>
+        <w:rPr>
+          <w:rFonts w:ascii="Arial" w:hAnsi="Arial" w:cs="Arial"/>
+        </w:rPr>
+        <w:t>).</w:t>
+      </w:r>
+    </w:p>
+    <w:p>
+      <w:pPr>
+        <w:pStyle w:val="NormalWeb"/>
+        <w:rPr>
+          <w:rFonts w:ascii="Arial" w:hAnsi="Arial" w:cs="Arial"/>
+        </w:rPr>
+      </w:pPr>
+    </w:p>
+    <w:p>
+      <w:pPr>
+        <w:pStyle w:val="NormalWeb"/>
+        <w:rPr>
+          <w:rFonts w:ascii="Arial" w:hAnsi="Arial" w:cs="Arial"/>
+        </w:rPr>
+      </w:pPr>
+    </w:p>
+    <w:p>
+      <w:pPr>
+        <w:pStyle w:val="NormalWeb"/>
+        <w:rPr>
+          <w:rFonts w:ascii="Arial" w:hAnsi="Arial" w:cs="Arial"/>
+          <w:b/>
+        </w:rPr>
+      </w:pPr>
+      <w:r>
+        <w:rPr>
+          <w:rFonts w:ascii="Arial" w:hAnsi="Arial" w:cs="Arial"/>
+          <w:b/>
+        </w:rPr>
+        <w:lastRenderedPageBreak/>
+        <w:t>Class Diagram (arayüzler ve veri yapısı):</w:t>
+      </w:r>
+    </w:p>
+    <w:p>
+      <w:pPr>
+        <w:rPr>
+          <w:rFonts w:ascii="Arial" w:hAnsi="Arial" w:cs="Arial"/>
+        </w:rPr>
+      </w:pPr>
+    </w:p>
+    <w:p>
+      <w:pPr>
+        <w:rPr>
+          <w:rFonts w:ascii="Arial" w:hAnsi="Arial" w:cs="Arial"/>
+        </w:rPr>
+      </w:pPr>
+      <w:r>
+        <w:rPr>
+          <w:rFonts w:ascii="Arial" w:hAnsi="Arial" w:cs="Arial"/>
+        </w:rPr>
+        <w:pict w14:anchorId="608EA38F">
+          <v:shape id="_x0000_i1043" type="#_x0000_t75" style="width:467.45pt;height:177.85pt">
+            <v:imagedata r:id="rId8" o:title="class_diagram"/>
+          </v:shape>
+        </w:pict>
+      </w:r>
+    </w:p>
+    <w:p>
+      <w:pPr>
+        <w:rPr>
+          <w:rFonts w:ascii="Arial" w:hAnsi="Arial" w:cs="Arial"/>
+        </w:rPr>
+      </w:pPr>
+    </w:p>
+    <w:p>
+      <w:pPr>
+        <w:rPr>
+          <w:rFonts w:ascii="Arial" w:hAnsi="Arial" w:cs="Arial"/>
+        </w:rPr>
+      </w:pPr>
+    </w:p>
+    <w:p>
+      <w:pPr>
+        <w:pStyle w:val="Balk2"/>
+        <w:rPr>
+          <w:rFonts w:ascii="Arial" w:hAnsi="Arial" w:cs="Arial"/>
+          <w:color w:val="auto"/>
+        </w:rPr>
+      </w:pPr>
+      <w:r>
+        <w:rPr>
+          <w:rFonts w:ascii="Arial" w:hAnsi="Arial" w:cs="Arial"/>
+          <w:color w:val="auto"/>
+        </w:rPr>
+        <w:t>4. Use Case Support in Design</w:t>
+      </w:r>
+    </w:p>
+    <w:p>
+      <w:pPr>
+        <w:pStyle w:val="NormalWeb"/>
+        <w:rPr>
+          <w:rFonts w:ascii="Arial" w:hAnsi="Arial" w:cs="Arial"/>
+        </w:rPr>
+      </w:pPr>
+      <w:r>
+        <w:rPr>
+          <w:rStyle w:val="citation-65"/>
+          <w:rFonts w:ascii="Arial" w:hAnsi="Arial" w:cs="Arial"/>
+        </w:rPr>
+        <w:t>Proje tasarımının test edileceği ve final sunumunda gösterilecek 4 temel Use Case aşağıda listelenmiştir</w:t>
+      </w:r>
+      <w:r>
+        <w:rPr>
+          <w:rFonts w:ascii="Arial" w:hAnsi="Arial" w:cs="Arial"/>
+        </w:rPr>
+        <w:t>.</w:t>
+      </w:r>
+    </w:p>
+    <w:p>
+      <w:pPr>
+        <w:pStyle w:val="NormalWeb"/>
+        <w:rPr>
+          <w:rFonts w:ascii="Arial" w:hAnsi="Arial" w:cs="Arial"/>
+        </w:rPr>
+      </w:pPr>
+      <w:r>
+        <w:rPr>
+          <w:rFonts w:ascii="Arial" w:hAnsi="Arial" w:cs="Arial"/>
           <w:b/>
           <w:bCs/>
-          <w:kern w:val="0"/>
-          <w:sz w:val="20"/>
-          <w:szCs w:val="20"/>
-          <w:lang w:val="tr-TR" w:eastAsia="tr-TR"/>
-          <w14:ligatures w14:val="none"/>
-        </w:rPr>
-        <w:t>IStudySessionDao</w:t>
-      </w:r>
-      <w:r>
-        <w:rPr>
-          <w:rFonts w:ascii="Arial" w:eastAsia="Times New Roman" w:hAnsi="Arial" w:cs="Arial"/>
+        </w:rPr>
+        <w:t>1. Ders ve Sınav Takibi</w:t>
+      </w:r>
+    </w:p>
+    <w:p>
+      <w:pPr>
+        <w:pStyle w:val="NormalWeb"/>
+        <w:rPr>
+          <w:rFonts w:ascii="Arial" w:hAnsi="Arial" w:cs="Arial"/>
+        </w:rPr>
+      </w:pPr>
+      <w:r>
+        <w:rPr>
+          <w:rFonts w:ascii="Arial" w:hAnsi="Arial" w:cs="Arial"/>
+        </w:rPr>
+        <w:t xml:space="preserve">İlk senaryo olan </w:t>
+      </w:r>
+      <w:r>
+        <w:rPr>
+          <w:rFonts w:ascii="Arial" w:hAnsi="Arial" w:cs="Arial"/>
+          <w:bCs/>
+        </w:rPr>
+        <w:t>Ders ve Sınav Takibi</w:t>
+      </w:r>
+      <w:r>
+        <w:rPr>
+          <w:rFonts w:ascii="Arial" w:hAnsi="Arial" w:cs="Arial"/>
+        </w:rPr>
+        <w:t xml:space="preserve">; ders ekleme, ders silme ve sınav takibi gereksinimlerini kapsamaktadır. Bu yapıda, kullanıcının takvim arayüzü üzerinden girdiği dersin kodu, adı ve tarihi Frontend katmanından alınarak doğrulanır ve ardından </w:t>
+      </w:r>
+      <w:r>
+        <w:rPr>
+          <w:rStyle w:val="HTMLKodu"/>
+          <w:rFonts w:ascii="Arial" w:eastAsiaTheme="majorEastAsia" w:hAnsi="Arial" w:cs="Arial"/>
+          <w:sz w:val="24"/>
+          <w:szCs w:val="24"/>
+        </w:rPr>
+        <w:t>DatabaseManager</w:t>
+      </w:r>
+      <w:r>
+        <w:rPr>
+          <w:rFonts w:ascii="Arial" w:hAnsi="Arial" w:cs="Arial"/>
+        </w:rPr>
+        <w:t xml:space="preserve"> aracılığıyla SQLite veritabanına INSERT veya DELETE işlemleriyle kalıcı olarak yansıtılır.</w:t>
+      </w:r>
+      <w:bookmarkStart w:id="0" w:name="_GoBack"/>
+      <w:bookmarkEnd w:id="0"/>
+    </w:p>
+    <w:p>
+      <w:pPr>
+        <w:pStyle w:val="NormalWeb"/>
+        <w:rPr>
+          <w:rFonts w:ascii="Arial" w:hAnsi="Arial" w:cs="Arial"/>
+        </w:rPr>
+      </w:pPr>
+      <w:r>
+        <w:rPr>
+          <w:rFonts w:ascii="Arial" w:hAnsi="Arial" w:cs="Arial"/>
           <w:b/>
           <w:bCs/>
-          <w:kern w:val="0"/>
-          <w:lang w:val="tr-TR" w:eastAsia="tr-TR"/>
-          <w14:ligatures w14:val="none"/>
-        </w:rPr>
-        <w:t xml:space="preserve"> ve </w:t>
-      </w:r>
-      <w:r>
-        <w:rPr>
-          <w:rFonts w:ascii="Arial" w:eastAsia="Times New Roman" w:hAnsi="Arial" w:cs="Arial"/>
+        </w:rPr>
+        <w:t>2. Çalışma Süresi ve Pomodoro Yönetimi</w:t>
+      </w:r>
+    </w:p>
+    <w:p>
+      <w:pPr>
+        <w:pStyle w:val="NormalWeb"/>
+        <w:rPr>
+          <w:rFonts w:ascii="Arial" w:hAnsi="Arial" w:cs="Arial"/>
+        </w:rPr>
+      </w:pPr>
+      <w:r>
+        <w:rPr>
+          <w:rFonts w:ascii="Arial" w:hAnsi="Arial" w:cs="Arial"/>
+        </w:rPr>
+        <w:t xml:space="preserve">İkinci senaryo olan </w:t>
+      </w:r>
+      <w:r>
+        <w:rPr>
+          <w:rFonts w:ascii="Arial" w:hAnsi="Arial" w:cs="Arial"/>
+          <w:bCs/>
+        </w:rPr>
+        <w:t>Çalışma Süresi ve Pomodoro Yönetimi</w:t>
+      </w:r>
+      <w:r>
+        <w:rPr>
+          <w:rFonts w:ascii="Arial" w:hAnsi="Arial" w:cs="Arial"/>
+        </w:rPr>
+        <w:t xml:space="preserve">, Pomodoro sayacı ve manuel süre tutma gereksinimleriyle eşleşmektedir. Kullanıcı "Çalışmaya Başla" butonuna tıkladığında </w:t>
+      </w:r>
+      <w:r>
+        <w:rPr>
+          <w:rStyle w:val="HTMLKodu"/>
+          <w:rFonts w:ascii="Arial" w:eastAsiaTheme="majorEastAsia" w:hAnsi="Arial" w:cs="Arial"/>
+        </w:rPr>
+        <w:t>TimeTrackerService</w:t>
+      </w:r>
+      <w:r>
+        <w:rPr>
+          <w:rFonts w:ascii="Arial" w:hAnsi="Arial" w:cs="Arial"/>
+        </w:rPr>
+        <w:t xml:space="preserve"> tetiklenir; bu işlem Java'da ayrı bir thread (iş parçacığı) üzerinde asenkron olarak çalışır ve süre sonlandığında elde edilen toplam zaman, kullanıcının seçtiği derse ait tabloya eklenmek üzere backend üzerinden veritabanına iletilir.</w:t>
+      </w:r>
+    </w:p>
+    <w:p>
+      <w:pPr>
+        <w:pStyle w:val="NormalWeb"/>
+        <w:rPr>
+          <w:rFonts w:ascii="Arial" w:hAnsi="Arial" w:cs="Arial"/>
+        </w:rPr>
+      </w:pPr>
+    </w:p>
+    <w:p>
+      <w:pPr>
+        <w:pStyle w:val="NormalWeb"/>
+        <w:rPr>
+          <w:rFonts w:ascii="Arial" w:hAnsi="Arial" w:cs="Arial"/>
+        </w:rPr>
+      </w:pPr>
+    </w:p>
+    <w:p>
+      <w:pPr>
+        <w:pStyle w:val="NormalWeb"/>
+        <w:rPr>
+          <w:rFonts w:ascii="Arial" w:hAnsi="Arial" w:cs="Arial"/>
+        </w:rPr>
+      </w:pPr>
+      <w:r>
+        <w:rPr>
+          <w:rFonts w:ascii="Arial" w:hAnsi="Arial" w:cs="Arial"/>
           <w:b/>
           <w:bCs/>
-          <w:kern w:val="0"/>
-          <w:sz w:val="20"/>
-          <w:szCs w:val="20"/>
-          <w:lang w:val="tr-TR" w:eastAsia="tr-TR"/>
-          <w14:ligatures w14:val="none"/>
-        </w:rPr>
-        <w:t>ICourseDao</w:t>
-      </w:r>
-      <w:r>
-        <w:rPr>
-          <w:rFonts w:ascii="Arial" w:eastAsia="Times New Roman" w:hAnsi="Arial" w:cs="Arial"/>
+        </w:rPr>
+        <w:lastRenderedPageBreak/>
+        <w:t>3. İstatistik Paneli Analizi</w:t>
+      </w:r>
+    </w:p>
+    <w:p>
+      <w:pPr>
+        <w:pStyle w:val="NormalWeb"/>
+        <w:rPr>
+          <w:rFonts w:ascii="Arial" w:hAnsi="Arial" w:cs="Arial"/>
+        </w:rPr>
+      </w:pPr>
+      <w:r>
+        <w:rPr>
+          <w:rStyle w:val="citation-59"/>
+          <w:rFonts w:ascii="Arial" w:hAnsi="Arial" w:cs="Arial"/>
+          <w:bCs/>
+        </w:rPr>
+        <w:t>Üçüncü senaryo olan İstatistik Paneli Analizi, istatistik paneli gereksinimini destekleyecek şekilde tasarlanmıştır. Kullanıcı istatistik sekmesini açtığında, backend katmanı SQLite veritabanına bir okuma isteği gönderir; veritabanından dönen ham çalışma süreleri Java sınıflarında gruplandırılır ve JavaFX grafik bileşenlerine uygun veri formatına dönüştürülerek ekranda haftalık veya aylık bazda görselleştirilir.</w:t>
+      </w:r>
+    </w:p>
+    <w:p>
+      <w:pPr>
+        <w:pStyle w:val="NormalWeb"/>
+        <w:rPr>
+          <w:rFonts w:ascii="Arial" w:hAnsi="Arial" w:cs="Arial"/>
+        </w:rPr>
+      </w:pPr>
+      <w:r>
+        <w:rPr>
+          <w:rFonts w:ascii="Arial" w:hAnsi="Arial" w:cs="Arial"/>
           <w:b/>
           <w:bCs/>
-          <w:kern w:val="0"/>
-          <w:lang w:val="tr-TR" w:eastAsia="tr-TR"/>
-          <w14:ligatures w14:val="none"/>
-        </w:rPr>
-        <w:t>:</w:t>
-      </w:r>
-      <w:r>
-        <w:rPr>
-          <w:rFonts w:ascii="Arial" w:eastAsia="Times New Roman" w:hAnsi="Arial" w:cs="Arial"/>
-          <w:kern w:val="0"/>
-          <w:lang w:val="tr-TR" w:eastAsia="tr-TR"/>
-          <w14:ligatures w14:val="none"/>
-        </w:rPr>
-        <w:t xml:space="preserve"> Veritabanı şema tasarımını uygulayan ve sorgu isteklerini SQLite üzerinde çalıştıran veri erişim arayüzleridir. </w:t>
-      </w:r>
-      <w:r>
-        <w:rPr>
-          <w:rFonts w:ascii="Arial" w:eastAsia="Times New Roman" w:hAnsi="Arial" w:cs="Arial"/>
-          <w:kern w:val="0"/>
-          <w:sz w:val="20"/>
-          <w:szCs w:val="20"/>
-          <w:lang w:val="tr-TR" w:eastAsia="tr-TR"/>
-          <w14:ligatures w14:val="none"/>
-        </w:rPr>
-        <w:t>DatabaseManager</w:t>
-      </w:r>
-      <w:r>
-        <w:rPr>
-          <w:rFonts w:ascii="Arial" w:eastAsia="Times New Roman" w:hAnsi="Arial" w:cs="Arial"/>
-          <w:kern w:val="0"/>
-          <w:lang w:val="tr-TR" w:eastAsia="tr-TR"/>
-          <w14:ligatures w14:val="none"/>
-        </w:rPr>
-        <w:t xml:space="preserve"> sınıfının sorumlulukları bu arayüzlere bölünerek modülerleştirilmiştir.</w:t>
-      </w:r>
-    </w:p>
-    <w:p>
-      <w:pPr>
-        <w:numPr>
-          <w:ilvl w:val="2"/>
-          <w:numId w:val="7"/>
-        </w:numPr>
-        <w:spacing w:before="100" w:beforeAutospacing="1" w:after="100" w:afterAutospacing="1" w:line="240" w:lineRule="auto"/>
-        <w:rPr>
-          <w:rFonts w:ascii="Arial" w:eastAsia="Times New Roman" w:hAnsi="Arial" w:cs="Arial"/>
-          <w:kern w:val="0"/>
-          <w:lang w:val="tr-TR" w:eastAsia="tr-TR"/>
-          <w14:ligatures w14:val="none"/>
-        </w:rPr>
-      </w:pPr>
-      <w:r>
-        <w:rPr>
-          <w:rFonts w:ascii="Arial" w:eastAsia="Times New Roman" w:hAnsi="Arial" w:cs="Arial"/>
-          <w:i/>
-          <w:iCs/>
-          <w:kern w:val="0"/>
-          <w:lang w:val="tr-TR" w:eastAsia="tr-TR"/>
-          <w14:ligatures w14:val="none"/>
-        </w:rPr>
-        <w:t>Önemli Metot İmzaları:</w:t>
-      </w:r>
-      <w:r>
-        <w:rPr>
-          <w:rFonts w:ascii="Arial" w:eastAsia="Times New Roman" w:hAnsi="Arial" w:cs="Arial"/>
-          <w:kern w:val="0"/>
-          <w:lang w:val="tr-TR" w:eastAsia="tr-TR"/>
-          <w14:ligatures w14:val="none"/>
-        </w:rPr>
-        <w:t xml:space="preserve"> </w:t>
-      </w:r>
-    </w:p>
-    <w:p>
-      <w:pPr>
-        <w:numPr>
-          <w:ilvl w:val="3"/>
-          <w:numId w:val="7"/>
-        </w:numPr>
-        <w:spacing w:before="100" w:beforeAutospacing="1" w:after="100" w:afterAutospacing="1" w:line="240" w:lineRule="auto"/>
-        <w:rPr>
-          <w:rFonts w:ascii="Arial" w:eastAsia="Times New Roman" w:hAnsi="Arial" w:cs="Arial"/>
-          <w:kern w:val="0"/>
-          <w:lang w:val="tr-TR" w:eastAsia="tr-TR"/>
-          <w14:ligatures w14:val="none"/>
-        </w:rPr>
-      </w:pPr>
-      <w:r>
-        <w:rPr>
-          <w:rFonts w:ascii="Arial" w:eastAsia="Times New Roman" w:hAnsi="Arial" w:cs="Arial"/>
-          <w:kern w:val="0"/>
-          <w:sz w:val="20"/>
-          <w:szCs w:val="20"/>
-          <w:lang w:val="tr-TR" w:eastAsia="tr-TR"/>
-          <w14:ligatures w14:val="none"/>
-        </w:rPr>
-        <w:t>void saveSession(StudySession session);</w:t>
-      </w:r>
-    </w:p>
-    <w:p>
-      <w:pPr>
-        <w:numPr>
-          <w:ilvl w:val="3"/>
-          <w:numId w:val="7"/>
-        </w:numPr>
-        <w:spacing w:before="100" w:beforeAutospacing="1" w:after="100" w:afterAutospacing="1" w:line="240" w:lineRule="auto"/>
-        <w:rPr>
-          <w:rFonts w:ascii="Arial" w:eastAsia="Times New Roman" w:hAnsi="Arial" w:cs="Arial"/>
-          <w:kern w:val="0"/>
-          <w:lang w:val="tr-TR" w:eastAsia="tr-TR"/>
-          <w14:ligatures w14:val="none"/>
-        </w:rPr>
-      </w:pPr>
-      <w:r>
-        <w:rPr>
-          <w:rFonts w:ascii="Arial" w:eastAsia="Times New Roman" w:hAnsi="Arial" w:cs="Arial"/>
-          <w:kern w:val="0"/>
-          <w:sz w:val="20"/>
-          <w:szCs w:val="20"/>
-          <w:lang w:val="tr-TR" w:eastAsia="tr-TR"/>
-          <w14:ligatures w14:val="none"/>
-        </w:rPr>
-        <w:t>List&lt;StudySession&gt; getSessionsByCourseId(int courseId);</w:t>
-      </w:r>
-    </w:p>
-    <w:p>
-      <w:pPr>
-        <w:numPr>
-          <w:ilvl w:val="3"/>
-          <w:numId w:val="7"/>
-        </w:numPr>
-        <w:spacing w:before="100" w:beforeAutospacing="1" w:after="100" w:afterAutospacing="1" w:line="240" w:lineRule="auto"/>
-        <w:rPr>
-          <w:rFonts w:ascii="Arial" w:eastAsia="Times New Roman" w:hAnsi="Arial" w:cs="Arial"/>
-          <w:kern w:val="0"/>
-          <w:lang w:val="tr-TR" w:eastAsia="tr-TR"/>
-          <w14:ligatures w14:val="none"/>
-        </w:rPr>
-      </w:pPr>
-      <w:r>
-        <w:rPr>
-          <w:rFonts w:ascii="Arial" w:eastAsia="Times New Roman" w:hAnsi="Arial" w:cs="Arial"/>
-          <w:kern w:val="0"/>
-          <w:sz w:val="20"/>
-          <w:szCs w:val="20"/>
-          <w:lang w:val="tr-TR" w:eastAsia="tr-TR"/>
-          <w14:ligatures w14:val="none"/>
-        </w:rPr>
-        <w:t>void addCourse(Course course);</w:t>
-      </w:r>
-    </w:p>
-    <w:p>
-      <w:pPr>
-        <w:numPr>
-          <w:ilvl w:val="3"/>
-          <w:numId w:val="7"/>
-        </w:numPr>
-        <w:spacing w:before="100" w:beforeAutospacing="1" w:after="100" w:afterAutospacing="1" w:line="240" w:lineRule="auto"/>
-        <w:rPr>
-          <w:rFonts w:ascii="Arial" w:eastAsia="Times New Roman" w:hAnsi="Arial" w:cs="Arial"/>
-          <w:kern w:val="0"/>
-          <w:lang w:val="tr-TR" w:eastAsia="tr-TR"/>
-          <w14:ligatures w14:val="none"/>
-        </w:rPr>
-      </w:pPr>
-      <w:r>
-        <w:rPr>
-          <w:rFonts w:ascii="Arial" w:eastAsia="Times New Roman" w:hAnsi="Arial" w:cs="Arial"/>
-          <w:kern w:val="0"/>
-          <w:sz w:val="20"/>
-          <w:szCs w:val="20"/>
-          <w:lang w:val="tr-TR" w:eastAsia="tr-TR"/>
-          <w14:ligatures w14:val="none"/>
-        </w:rPr>
-        <w:t>void deleteCourse(int courseId);</w:t>
-      </w:r>
-    </w:p>
-    <w:p>
-      <w:pPr>
-        <w:numPr>
-          <w:ilvl w:val="0"/>
-          <w:numId w:val="7"/>
-        </w:numPr>
-        <w:spacing w:before="100" w:beforeAutospacing="1" w:after="100" w:afterAutospacing="1" w:line="240" w:lineRule="auto"/>
-        <w:rPr>
-          <w:rFonts w:ascii="Arial" w:eastAsia="Times New Roman" w:hAnsi="Arial" w:cs="Arial"/>
-          <w:kern w:val="0"/>
-          <w:lang w:val="tr-TR" w:eastAsia="tr-TR"/>
-          <w14:ligatures w14:val="none"/>
-        </w:rPr>
-      </w:pPr>
-      <w:r>
-        <w:rPr>
-          <w:rFonts w:ascii="Arial" w:eastAsia="Times New Roman" w:hAnsi="Arial" w:cs="Arial"/>
+        </w:rPr>
+        <w:t>4. Çalışılacaklar Listesi Oluşturma</w:t>
+      </w:r>
+    </w:p>
+    <w:p>
+      <w:pPr>
+        <w:pStyle w:val="NormalWeb"/>
+        <w:rPr>
+          <w:rStyle w:val="citation-56"/>
+          <w:rFonts w:ascii="Arial" w:hAnsi="Arial" w:cs="Arial"/>
+          <w:bCs/>
+        </w:rPr>
+      </w:pPr>
+      <w:r>
+        <w:rPr>
+          <w:rStyle w:val="citation-56"/>
+          <w:rFonts w:ascii="Arial" w:hAnsi="Arial" w:cs="Arial"/>
+          <w:bCs/>
+        </w:rPr>
+        <w:t>Son senaryo olan Çalışılacaklar Listesi Oluşturma ise günlük görevlerin takibi gereksinimiyle doğrudan eşleşir. Gün içinde bitirilmesi gereken görevler UI üzerinden girildiğinde doğrudan veritabanına eklenir ve uygulamanın yerel veri saklama yapısı sayesinde, program tamamen kapatılsa bile bu liste güvenle korunarak tekrar açılışta kayıpsız bir şekilde geri yüklenir.</w:t>
+      </w:r>
+    </w:p>
+    <w:p>
+      <w:pPr>
+        <w:pStyle w:val="NormalWeb"/>
+        <w:rPr>
+          <w:rFonts w:ascii="Arial" w:hAnsi="Arial" w:cs="Arial"/>
+        </w:rPr>
+      </w:pPr>
+    </w:p>
+    <w:p>
+      <w:pPr>
+        <w:pStyle w:val="NormalWeb"/>
+        <w:rPr>
+          <w:rFonts w:ascii="Arial" w:hAnsi="Arial" w:cs="Arial"/>
           <w:b/>
-          <w:bCs/>
-          <w:kern w:val="0"/>
-          <w:lang w:val="tr-TR" w:eastAsia="tr-TR"/>
-          <w14:ligatures w14:val="none"/>
-        </w:rPr>
-        <w:t>İş Mantığı Arayüzleri (Business Service):</w:t>
-      </w:r>
-    </w:p>
-    <w:p>
-      <w:pPr>
-        <w:numPr>
-          <w:ilvl w:val="1"/>
-          <w:numId w:val="7"/>
-        </w:numPr>
-        <w:spacing w:before="100" w:beforeAutospacing="1" w:after="100" w:afterAutospacing="1" w:line="240" w:lineRule="auto"/>
-        <w:rPr>
-          <w:rFonts w:ascii="Arial" w:eastAsia="Times New Roman" w:hAnsi="Arial" w:cs="Arial"/>
-          <w:kern w:val="0"/>
-          <w:lang w:val="tr-TR" w:eastAsia="tr-TR"/>
-          <w14:ligatures w14:val="none"/>
-        </w:rPr>
-      </w:pPr>
-      <w:r>
-        <w:rPr>
-          <w:rFonts w:ascii="Arial" w:eastAsia="Times New Roman" w:hAnsi="Arial" w:cs="Arial"/>
+        </w:rPr>
+      </w:pPr>
+      <w:r>
+        <w:rPr>
+          <w:rFonts w:ascii="Arial" w:hAnsi="Arial" w:cs="Arial"/>
           <w:b/>
-          <w:bCs/>
-          <w:kern w:val="0"/>
-          <w:sz w:val="20"/>
-          <w:szCs w:val="20"/>
-          <w:lang w:val="tr-TR" w:eastAsia="tr-TR"/>
-          <w14:ligatures w14:val="none"/>
-        </w:rPr>
-        <w:t>ITimeTrackerService</w:t>
-      </w:r>
-      <w:r>
-        <w:rPr>
-          <w:rFonts w:ascii="Arial" w:eastAsia="Times New Roman" w:hAnsi="Arial" w:cs="Arial"/>
-          <w:b/>
-          <w:bCs/>
-          <w:kern w:val="0"/>
-          <w:lang w:val="tr-TR" w:eastAsia="tr-TR"/>
-          <w14:ligatures w14:val="none"/>
-        </w:rPr>
-        <w:t>:</w:t>
-      </w:r>
-      <w:r>
-        <w:rPr>
-          <w:rFonts w:ascii="Arial" w:eastAsia="Times New Roman" w:hAnsi="Arial" w:cs="Arial"/>
-          <w:kern w:val="0"/>
-          <w:lang w:val="tr-TR" w:eastAsia="tr-TR"/>
-          <w14:ligatures w14:val="none"/>
-        </w:rPr>
-        <w:t xml:space="preserve"> Pomodoro veya serbest kronometre oturumlarını kontrol eden iş mantığı arayüzüdür. Arka planda zamanlayıcı (Timer/Thread) işlemlerini yürütür ve çalışma bittiğinde, hesaplanan süreyi ilgili ders kodu ile eşleştirerek </w:t>
-      </w:r>
-      <w:r>
-        <w:rPr>
-          <w:rFonts w:ascii="Arial" w:eastAsia="Times New Roman" w:hAnsi="Arial" w:cs="Arial"/>
-          <w:kern w:val="0"/>
-          <w:sz w:val="20"/>
-          <w:szCs w:val="20"/>
-          <w:lang w:val="tr-TR" w:eastAsia="tr-TR"/>
-          <w14:ligatures w14:val="none"/>
-        </w:rPr>
-        <w:t>IStudySessionDao</w:t>
-      </w:r>
-      <w:r>
-        <w:rPr>
-          <w:rFonts w:ascii="Arial" w:eastAsia="Times New Roman" w:hAnsi="Arial" w:cs="Arial"/>
-          <w:kern w:val="0"/>
-          <w:lang w:val="tr-TR" w:eastAsia="tr-TR"/>
-          <w14:ligatures w14:val="none"/>
-        </w:rPr>
-        <w:t xml:space="preserve"> üzerinden veritabanına iletir.</w:t>
-      </w:r>
-    </w:p>
-    <w:p>
-      <w:pPr>
-        <w:numPr>
-          <w:ilvl w:val="2"/>
-          <w:numId w:val="7"/>
-        </w:numPr>
-        <w:spacing w:before="100" w:beforeAutospacing="1" w:after="100" w:afterAutospacing="1" w:line="240" w:lineRule="auto"/>
-        <w:rPr>
-          <w:rFonts w:ascii="Arial" w:eastAsia="Times New Roman" w:hAnsi="Arial" w:cs="Arial"/>
-          <w:kern w:val="0"/>
-          <w:lang w:val="tr-TR" w:eastAsia="tr-TR"/>
-          <w14:ligatures w14:val="none"/>
-        </w:rPr>
-      </w:pPr>
-      <w:r>
-        <w:rPr>
-          <w:rFonts w:ascii="Arial" w:eastAsia="Times New Roman" w:hAnsi="Arial" w:cs="Arial"/>
-          <w:i/>
-          <w:iCs/>
-          <w:kern w:val="0"/>
-          <w:lang w:val="tr-TR" w:eastAsia="tr-TR"/>
-          <w14:ligatures w14:val="none"/>
-        </w:rPr>
-        <w:t>Önemli Metot İmzaları:</w:t>
-      </w:r>
-    </w:p>
-    <w:p>
-      <w:pPr>
-        <w:numPr>
-          <w:ilvl w:val="3"/>
-          <w:numId w:val="7"/>
-        </w:numPr>
-        <w:spacing w:before="100" w:beforeAutospacing="1" w:after="100" w:afterAutospacing="1" w:line="240" w:lineRule="auto"/>
-        <w:rPr>
-          <w:rFonts w:ascii="Arial" w:eastAsia="Times New Roman" w:hAnsi="Arial" w:cs="Arial"/>
-          <w:kern w:val="0"/>
-          <w:lang w:val="tr-TR" w:eastAsia="tr-TR"/>
-          <w14:ligatures w14:val="none"/>
-        </w:rPr>
-      </w:pPr>
-      <w:r>
-        <w:rPr>
-          <w:rFonts w:ascii="Arial" w:eastAsia="Times New Roman" w:hAnsi="Arial" w:cs="Arial"/>
-          <w:kern w:val="0"/>
-          <w:sz w:val="20"/>
-          <w:szCs w:val="20"/>
-          <w:lang w:val="tr-TR" w:eastAsia="tr-TR"/>
-          <w14:ligatures w14:val="none"/>
-        </w:rPr>
-        <w:t>void startTimer();</w:t>
-      </w:r>
-    </w:p>
-    <w:p>
-      <w:pPr>
-        <w:numPr>
-          <w:ilvl w:val="3"/>
-          <w:numId w:val="7"/>
-        </w:numPr>
-        <w:spacing w:before="100" w:beforeAutospacing="1" w:after="100" w:afterAutospacing="1" w:line="240" w:lineRule="auto"/>
-        <w:rPr>
-          <w:rFonts w:ascii="Arial" w:eastAsia="Times New Roman" w:hAnsi="Arial" w:cs="Arial"/>
-          <w:kern w:val="0"/>
-          <w:lang w:val="tr-TR" w:eastAsia="tr-TR"/>
-          <w14:ligatures w14:val="none"/>
-        </w:rPr>
-      </w:pPr>
-      <w:r>
-        <w:rPr>
-          <w:rFonts w:ascii="Arial" w:eastAsia="Times New Roman" w:hAnsi="Arial" w:cs="Arial"/>
-          <w:kern w:val="0"/>
-          <w:sz w:val="20"/>
-          <w:szCs w:val="20"/>
-          <w:lang w:val="tr-TR" w:eastAsia="tr-TR"/>
-          <w14:ligatures w14:val="none"/>
-        </w:rPr>
-        <w:t>void pauseTimer();</w:t>
-      </w:r>
-    </w:p>
-    <w:p>
-      <w:pPr>
-        <w:numPr>
-          <w:ilvl w:val="3"/>
-          <w:numId w:val="7"/>
-        </w:numPr>
-        <w:spacing w:before="100" w:beforeAutospacing="1" w:after="100" w:afterAutospacing="1" w:line="240" w:lineRule="auto"/>
-        <w:rPr>
-          <w:rFonts w:ascii="Arial" w:eastAsia="Times New Roman" w:hAnsi="Arial" w:cs="Arial"/>
-          <w:kern w:val="0"/>
-          <w:lang w:val="tr-TR" w:eastAsia="tr-TR"/>
-          <w14:ligatures w14:val="none"/>
-        </w:rPr>
-      </w:pPr>
-      <w:r>
-        <w:rPr>
-          <w:rFonts w:ascii="Arial" w:eastAsia="Times New Roman" w:hAnsi="Arial" w:cs="Arial"/>
-          <w:kern w:val="0"/>
-          <w:sz w:val="20"/>
-          <w:szCs w:val="20"/>
-          <w:lang w:val="tr-TR" w:eastAsia="tr-TR"/>
-          <w14:ligatures w14:val="none"/>
-        </w:rPr>
-        <w:t>void stopTimer(int courseId);</w:t>
-      </w:r>
-    </w:p>
-    <w:p>
-      <w:pPr>
-        <w:numPr>
-          <w:ilvl w:val="3"/>
-          <w:numId w:val="7"/>
-        </w:numPr>
-        <w:spacing w:before="100" w:beforeAutospacing="1" w:after="100" w:afterAutospacing="1" w:line="240" w:lineRule="auto"/>
-        <w:rPr>
-          <w:rFonts w:ascii="Arial" w:eastAsia="Times New Roman" w:hAnsi="Arial" w:cs="Arial"/>
-          <w:kern w:val="0"/>
-          <w:lang w:val="tr-TR" w:eastAsia="tr-TR"/>
-          <w14:ligatures w14:val="none"/>
-        </w:rPr>
-      </w:pPr>
-      <w:r>
-        <w:rPr>
-          <w:rFonts w:ascii="Arial" w:eastAsia="Times New Roman" w:hAnsi="Arial" w:cs="Arial"/>
-          <w:kern w:val="0"/>
-          <w:sz w:val="20"/>
-          <w:szCs w:val="20"/>
-          <w:lang w:val="tr-TR" w:eastAsia="tr-TR"/>
-          <w14:ligatures w14:val="none"/>
-        </w:rPr>
-        <w:t>int getElapsedTimeInSeconds();</w:t>
-      </w:r>
-    </w:p>
-    <w:p>
-      <w:pPr>
-        <w:numPr>
-          <w:ilvl w:val="1"/>
-          <w:numId w:val="7"/>
-        </w:numPr>
-        <w:spacing w:before="100" w:beforeAutospacing="1" w:after="100" w:afterAutospacing="1" w:line="240" w:lineRule="auto"/>
-        <w:rPr>
-          <w:rFonts w:ascii="Arial" w:eastAsia="Times New Roman" w:hAnsi="Arial" w:cs="Arial"/>
-          <w:kern w:val="0"/>
-          <w:lang w:val="tr-TR" w:eastAsia="tr-TR"/>
-          <w14:ligatures w14:val="none"/>
-        </w:rPr>
-      </w:pPr>
-      <w:r>
-        <w:rPr>
-          <w:rFonts w:ascii="Arial" w:eastAsia="Times New Roman" w:hAnsi="Arial" w:cs="Arial"/>
-          <w:b/>
-          <w:bCs/>
-          <w:kern w:val="0"/>
-          <w:sz w:val="20"/>
-          <w:szCs w:val="20"/>
-          <w:lang w:val="tr-TR" w:eastAsia="tr-TR"/>
-          <w14:ligatures w14:val="none"/>
-        </w:rPr>
-        <w:t>IStatisticsService</w:t>
-      </w:r>
-      <w:r>
-        <w:rPr>
-          <w:rFonts w:ascii="Arial" w:eastAsia="Times New Roman" w:hAnsi="Arial" w:cs="Arial"/>
-          <w:b/>
-          <w:bCs/>
-          <w:kern w:val="0"/>
-          <w:lang w:val="tr-TR" w:eastAsia="tr-TR"/>
-          <w14:ligatures w14:val="none"/>
-        </w:rPr>
-        <w:t>:</w:t>
-      </w:r>
-      <w:r>
-        <w:rPr>
-          <w:rFonts w:ascii="Arial" w:eastAsia="Times New Roman" w:hAnsi="Arial" w:cs="Arial"/>
-          <w:kern w:val="0"/>
-          <w:lang w:val="tr-TR" w:eastAsia="tr-TR"/>
-          <w14:ligatures w14:val="none"/>
-        </w:rPr>
-        <w:t xml:space="preserve"> Veritabanından çekilen ham çalışma verilerini işleyerek Frontend katmanındaki grafiklerin anlayacağı formata (yüzdelik dilimler, toplam saatler) dönüştüren arayüzdür.</w:t>
-      </w:r>
-    </w:p>
-    <w:p>
-      <w:pPr>
-        <w:numPr>
-          <w:ilvl w:val="2"/>
-          <w:numId w:val="7"/>
-        </w:numPr>
-        <w:spacing w:before="100" w:beforeAutospacing="1" w:after="100" w:afterAutospacing="1" w:line="240" w:lineRule="auto"/>
-        <w:rPr>
-          <w:rFonts w:ascii="Arial" w:eastAsia="Times New Roman" w:hAnsi="Arial" w:cs="Arial"/>
-          <w:kern w:val="0"/>
-          <w:lang w:val="tr-TR" w:eastAsia="tr-TR"/>
-          <w14:ligatures w14:val="none"/>
-        </w:rPr>
-      </w:pPr>
-      <w:r>
-        <w:rPr>
-          <w:rFonts w:ascii="Arial" w:eastAsia="Times New Roman" w:hAnsi="Arial" w:cs="Arial"/>
-          <w:i/>
-          <w:iCs/>
-          <w:kern w:val="0"/>
-          <w:lang w:val="tr-TR" w:eastAsia="tr-TR"/>
-          <w14:ligatures w14:val="none"/>
-        </w:rPr>
-        <w:t>Önemli Metot İmzaları:</w:t>
-      </w:r>
-    </w:p>
-    <w:p>
-      <w:pPr>
-        <w:numPr>
-          <w:ilvl w:val="3"/>
-          <w:numId w:val="7"/>
-        </w:numPr>
-        <w:spacing w:before="100" w:beforeAutospacing="1" w:after="100" w:afterAutospacing="1" w:line="240" w:lineRule="auto"/>
-        <w:rPr>
-          <w:rFonts w:ascii="Arial" w:eastAsia="Times New Roman" w:hAnsi="Arial" w:cs="Arial"/>
-          <w:kern w:val="0"/>
-          <w:lang w:val="tr-TR" w:eastAsia="tr-TR"/>
-          <w14:ligatures w14:val="none"/>
-        </w:rPr>
-      </w:pPr>
-      <w:r>
-        <w:rPr>
-          <w:rFonts w:ascii="Arial" w:eastAsia="Times New Roman" w:hAnsi="Arial" w:cs="Arial"/>
-          <w:kern w:val="0"/>
-          <w:sz w:val="20"/>
-          <w:szCs w:val="20"/>
-          <w:lang w:val="tr-TR" w:eastAsia="tr-TR"/>
-          <w14:ligatures w14:val="none"/>
-        </w:rPr>
-        <w:t>Map&lt;String, Integer&gt; calculateWeeklyFocus();</w:t>
+        </w:rPr>
+        <w:t xml:space="preserve">Sequence Diagram (fonksiyonların çalışma akışı): </w:t>
       </w:r>
     </w:p>
     <w:p>
@@ -1984,108 +2516,13 @@
       <w:r>
         <w:rPr>
           <w:rFonts w:ascii="Arial" w:hAnsi="Arial" w:cs="Arial"/>
-          <w:b/>
-          <w:bCs/>
-        </w:rPr>
-        <w:t>Visual Interfaces:</w:t>
-      </w:r>
-      <w:r>
-        <w:rPr>
-          <w:rFonts w:ascii="Arial" w:hAnsi="Arial" w:cs="Arial"/>
-        </w:rPr>
-        <w:t xml:space="preserve"> </w:t>
-      </w:r>
-      <w:r>
-        <w:rPr>
-          <w:rStyle w:val="citation-67"/>
-          <w:rFonts w:ascii="Arial" w:hAnsi="Arial" w:cs="Arial"/>
-        </w:rPr>
-        <w:t>Sistem, JavaFX kullanılarak tasarlanmış interaktif bir Dashboard, haftalık programın görüldüğü Takvim ekranı ve verilerin pasta/çubuk grafiklerle sunulduğu İstatistik panelinden oluşmaktadır</w:t>
-      </w:r>
-      <w:r>
-        <w:rPr>
-          <w:rFonts w:ascii="Arial" w:hAnsi="Arial" w:cs="Arial"/>
-        </w:rPr>
-        <w:t xml:space="preserve">. </w:t>
-      </w:r>
-      <w:r>
-        <w:rPr>
-          <w:rStyle w:val="citation-66"/>
-          <w:rFonts w:ascii="Arial" w:hAnsi="Arial" w:cs="Arial"/>
-        </w:rPr>
-        <w:t xml:space="preserve">(Projenin GitHub deposunda UI tasarımlarını gösteren wireframe ve ekran görüntüleri </w:t>
-      </w:r>
-      <w:r>
-        <w:rPr>
-          <w:rStyle w:val="citation-66"/>
-          <w:rFonts w:ascii="Arial" w:hAnsi="Arial" w:cs="Arial"/>
-          <w:sz w:val="20"/>
-          <w:szCs w:val="20"/>
-        </w:rPr>
-        <w:t>UI_Screenshots</w:t>
-      </w:r>
-      <w:r>
-        <w:rPr>
-          <w:rStyle w:val="citation-66"/>
-          <w:rFonts w:ascii="Arial" w:hAnsi="Arial" w:cs="Arial"/>
-        </w:rPr>
-        <w:t xml:space="preserve"> klasörü altında bulunacaktır </w:t>
-      </w:r>
-      <w:r>
-        <w:rPr>
-          <w:rFonts w:ascii="Arial" w:hAnsi="Arial" w:cs="Arial"/>
-        </w:rPr>
-        <w:t>).</w:t>
-      </w:r>
-    </w:p>
-    <w:p>
-      <w:pPr>
-        <w:rPr>
-          <w:rFonts w:ascii="Arial" w:hAnsi="Arial" w:cs="Arial"/>
-        </w:rPr>
-      </w:pPr>
-    </w:p>
-    <w:p>
-      <w:pPr>
-        <w:rPr>
-          <w:rFonts w:ascii="Arial" w:hAnsi="Arial" w:cs="Arial"/>
-        </w:rPr>
-      </w:pPr>
-    </w:p>
-    <w:p>
-      <w:pPr>
-        <w:rPr>
-          <w:rFonts w:ascii="Arial" w:hAnsi="Arial" w:cs="Arial"/>
-        </w:rPr>
-      </w:pPr>
-    </w:p>
-    <w:p>
-      <w:pPr>
-        <w:rPr>
-          <w:rFonts w:ascii="Arial" w:hAnsi="Arial" w:cs="Arial"/>
-        </w:rPr>
-      </w:pPr>
-    </w:p>
-    <w:p>
-      <w:pPr>
-        <w:rPr>
-          <w:rFonts w:ascii="Arial" w:hAnsi="Arial" w:cs="Arial"/>
-        </w:rPr>
-      </w:pPr>
-    </w:p>
-    <w:p>
-      <w:pPr>
-        <w:rPr>
-          <w:rFonts w:ascii="Arial" w:hAnsi="Arial" w:cs="Arial"/>
-        </w:rPr>
-      </w:pPr>
-    </w:p>
-    <w:p>
-      <w:pPr>
-        <w:rPr>
-          <w:rFonts w:ascii="Arial" w:hAnsi="Arial" w:cs="Arial"/>
-        </w:rPr>
-      </w:pPr>
+        </w:rPr>
+        <w:pict w14:anchorId="61ED5562">
+          <v:shape id="_x0000_i1044" type="#_x0000_t75" style="width:466.95pt;height:242.35pt">
+            <v:imagedata r:id="rId9" o:title="sequence_diagram"/>
+          </v:shape>
+        </w:pict>
+      </w:r>
     </w:p>
     <w:p>
       <w:pPr>
@@ -2095,265 +2532,47 @@
           <w:color w:val="auto"/>
         </w:rPr>
       </w:pPr>
-      <w:r>
+    </w:p>
+    <w:p>
+      <w:pPr>
+        <w:pStyle w:val="Balk2"/>
         <w:rPr>
           <w:rFonts w:ascii="Arial" w:hAnsi="Arial" w:cs="Arial"/>
           <w:color w:val="auto"/>
         </w:rPr>
+      </w:pPr>
+    </w:p>
+    <w:p>
+      <w:pPr>
+        <w:pStyle w:val="Balk2"/>
+        <w:rPr>
+          <w:rFonts w:ascii="Arial" w:hAnsi="Arial" w:cs="Arial"/>
+          <w:color w:val="auto"/>
+        </w:rPr>
+      </w:pPr>
+    </w:p>
+    <w:p>
+      <w:pPr>
+        <w:rPr>
+          <w:rFonts w:ascii="Arial" w:hAnsi="Arial" w:cs="Arial"/>
+        </w:rPr>
+      </w:pPr>
+    </w:p>
+    <w:p>
+      <w:pPr>
+        <w:pStyle w:val="Balk2"/>
+        <w:rPr>
+          <w:rFonts w:ascii="Arial" w:hAnsi="Arial" w:cs="Arial"/>
+          <w:color w:val="auto"/>
+        </w:rPr>
+      </w:pPr>
+      <w:r>
+        <w:rPr>
+          <w:rFonts w:ascii="Arial" w:hAnsi="Arial" w:cs="Arial"/>
+          <w:color w:val="auto"/>
+        </w:rPr>
         <w:lastRenderedPageBreak/>
-        <w:t>4</w:t>
-      </w:r>
-      <w:r>
-        <w:rPr>
-          <w:rFonts w:ascii="Arial" w:hAnsi="Arial" w:cs="Arial"/>
-          <w:color w:val="auto"/>
-        </w:rPr>
-        <w:t>. Use Case Support in Design</w:t>
-      </w:r>
-    </w:p>
-    <w:p>
-      <w:pPr>
-        <w:pStyle w:val="NormalWeb"/>
-        <w:rPr>
-          <w:rFonts w:ascii="Arial" w:hAnsi="Arial" w:cs="Arial"/>
-        </w:rPr>
-      </w:pPr>
-      <w:r>
-        <w:rPr>
-          <w:rStyle w:val="citation-65"/>
-          <w:rFonts w:ascii="Arial" w:hAnsi="Arial" w:cs="Arial"/>
-        </w:rPr>
-        <w:t>Proje tasarımının test edileceği ve final sunumunda gösterilecek 4 temel Use Case aşağıda listelenmiştir</w:t>
-      </w:r>
-      <w:r>
-        <w:rPr>
-          <w:rFonts w:ascii="Arial" w:hAnsi="Arial" w:cs="Arial"/>
-        </w:rPr>
-        <w:t>.</w:t>
-      </w:r>
-    </w:p>
-    <w:p>
-      <w:pPr>
-        <w:pStyle w:val="NormalWeb"/>
-        <w:rPr>
-          <w:rFonts w:ascii="Arial" w:hAnsi="Arial" w:cs="Arial"/>
-        </w:rPr>
-      </w:pPr>
-      <w:r>
-        <w:rPr>
-          <w:rFonts w:ascii="Arial" w:hAnsi="Arial" w:cs="Arial"/>
-          <w:b/>
-          <w:bCs/>
-        </w:rPr>
-        <w:t>1. Ders ve Sınav Takibi</w:t>
-      </w:r>
-    </w:p>
-    <w:p>
-      <w:pPr>
-        <w:pStyle w:val="NormalWeb"/>
-        <w:rPr>
-          <w:rFonts w:ascii="Arial" w:hAnsi="Arial" w:cs="Arial"/>
-        </w:rPr>
-      </w:pPr>
-      <w:r>
-        <w:rPr>
-          <w:rFonts w:ascii="Arial" w:hAnsi="Arial" w:cs="Arial"/>
-        </w:rPr>
-        <w:t xml:space="preserve">İlk senaryo olan </w:t>
-      </w:r>
-      <w:r>
-        <w:rPr>
-          <w:rFonts w:ascii="Arial" w:hAnsi="Arial" w:cs="Arial"/>
-          <w:bCs/>
-        </w:rPr>
-        <w:t>Ders ve Sınav Takibi</w:t>
-      </w:r>
-      <w:r>
-        <w:rPr>
-          <w:rFonts w:ascii="Arial" w:hAnsi="Arial" w:cs="Arial"/>
-        </w:rPr>
-        <w:t xml:space="preserve">; ders ekleme, ders silme ve sınav takibi gereksinimlerini kapsamaktadır. Bu yapıda, kullanıcının takvim arayüzü üzerinden girdiği dersin kodu, adı ve tarihi Frontend katmanından alınarak doğrulanır ve ardından </w:t>
-      </w:r>
-      <w:r>
-        <w:rPr>
-          <w:rStyle w:val="HTMLKodu"/>
-          <w:rFonts w:ascii="Arial" w:eastAsiaTheme="majorEastAsia" w:hAnsi="Arial" w:cs="Arial"/>
-        </w:rPr>
-        <w:t>DatabaseManager</w:t>
-      </w:r>
-      <w:r>
-        <w:rPr>
-          <w:rFonts w:ascii="Arial" w:hAnsi="Arial" w:cs="Arial"/>
-        </w:rPr>
-        <w:t xml:space="preserve"> aracılığıyla SQLite veritabanına INSERT veya DELETE işlemleriyle kalıcı olarak yansıtılır.</w:t>
-      </w:r>
-    </w:p>
-    <w:p>
-      <w:pPr>
-        <w:pStyle w:val="NormalWeb"/>
-        <w:rPr>
-          <w:rFonts w:ascii="Arial" w:hAnsi="Arial" w:cs="Arial"/>
-        </w:rPr>
-      </w:pPr>
-      <w:r>
-        <w:rPr>
-          <w:rFonts w:ascii="Arial" w:hAnsi="Arial" w:cs="Arial"/>
-          <w:b/>
-          <w:bCs/>
-        </w:rPr>
-        <w:t>2. Çalışma Süresi ve Pomodoro Yönetimi</w:t>
-      </w:r>
-    </w:p>
-    <w:p>
-      <w:pPr>
-        <w:pStyle w:val="NormalWeb"/>
-        <w:rPr>
-          <w:rFonts w:ascii="Arial" w:hAnsi="Arial" w:cs="Arial"/>
-        </w:rPr>
-      </w:pPr>
-      <w:r>
-        <w:rPr>
-          <w:rFonts w:ascii="Arial" w:hAnsi="Arial" w:cs="Arial"/>
-        </w:rPr>
-        <w:t xml:space="preserve">İkinci senaryo olan </w:t>
-      </w:r>
-      <w:r>
-        <w:rPr>
-          <w:rFonts w:ascii="Arial" w:hAnsi="Arial" w:cs="Arial"/>
-          <w:bCs/>
-        </w:rPr>
-        <w:t>Çalışma Süresi ve Pomodoro Yönetimi</w:t>
-      </w:r>
-      <w:r>
-        <w:rPr>
-          <w:rFonts w:ascii="Arial" w:hAnsi="Arial" w:cs="Arial"/>
-        </w:rPr>
-        <w:t xml:space="preserve">, Pomodoro sayacı ve manuel süre tutma gereksinimleriyle eşleşmektedir. Kullanıcı "Çalışmaya Başla" butonuna tıkladığında </w:t>
-      </w:r>
-      <w:r>
-        <w:rPr>
-          <w:rStyle w:val="HTMLKodu"/>
-          <w:rFonts w:ascii="Arial" w:eastAsiaTheme="majorEastAsia" w:hAnsi="Arial" w:cs="Arial"/>
-        </w:rPr>
-        <w:t>TimeTrackerService</w:t>
-      </w:r>
-      <w:r>
-        <w:rPr>
-          <w:rFonts w:ascii="Arial" w:hAnsi="Arial" w:cs="Arial"/>
-        </w:rPr>
-        <w:t xml:space="preserve"> tetiklenir; bu işlem Java'da ayrı bir thread (iş parçacığı) üzerinde asenkron olarak çalışır ve süre sonlandığında elde edilen toplam zaman, kullanıcının seçtiği derse ait tabloya eklenmek üzere backend üzerinden veritabanına iletilir.</w:t>
-      </w:r>
-    </w:p>
-    <w:p>
-      <w:pPr>
-        <w:pStyle w:val="NormalWeb"/>
-        <w:rPr>
-          <w:rFonts w:ascii="Arial" w:hAnsi="Arial" w:cs="Arial"/>
-        </w:rPr>
-      </w:pPr>
-      <w:r>
-        <w:rPr>
-          <w:rFonts w:ascii="Arial" w:hAnsi="Arial" w:cs="Arial"/>
-          <w:b/>
-          <w:bCs/>
-        </w:rPr>
-        <w:t>3. İstatistik Paneli Analizi</w:t>
-      </w:r>
-    </w:p>
-    <w:p>
-      <w:pPr>
-        <w:pStyle w:val="NormalWeb"/>
-        <w:rPr>
-          <w:rFonts w:ascii="Arial" w:hAnsi="Arial" w:cs="Arial"/>
-        </w:rPr>
-      </w:pPr>
-      <w:r>
-        <w:rPr>
-          <w:rStyle w:val="citation-59"/>
-          <w:rFonts w:ascii="Arial" w:hAnsi="Arial" w:cs="Arial"/>
-          <w:bCs/>
-        </w:rPr>
-        <w:t>Üçüncü senaryo olan İstatistik Paneli Analizi, istatistik paneli gereksinimini destekleyecek şekilde tasarlanmıştır. Kullanıcı istatistik sekmesini açtığında, backend katmanı SQLite veritabanına bir okuma isteği gönderir; veritabanından dönen ham çalışma süreleri Java sınıflarında gruplandırılır ve JavaFX grafik bileşenlerine uygun veri formatına dönüştürülerek ekranda haftalık veya aylık bazda görselleştirilir.</w:t>
-      </w:r>
-    </w:p>
-    <w:p>
-      <w:pPr>
-        <w:pStyle w:val="NormalWeb"/>
-        <w:rPr>
-          <w:rFonts w:ascii="Arial" w:hAnsi="Arial" w:cs="Arial"/>
-        </w:rPr>
-      </w:pPr>
-      <w:r>
-        <w:rPr>
-          <w:rFonts w:ascii="Arial" w:hAnsi="Arial" w:cs="Arial"/>
-          <w:b/>
-          <w:bCs/>
-        </w:rPr>
-        <w:t>4. Çalışılacaklar Listesi Oluşturma</w:t>
-      </w:r>
-    </w:p>
-    <w:p>
-      <w:pPr>
-        <w:pStyle w:val="NormalWeb"/>
-        <w:rPr>
-          <w:rFonts w:ascii="Arial" w:hAnsi="Arial" w:cs="Arial"/>
-        </w:rPr>
-      </w:pPr>
-      <w:r>
-        <w:rPr>
-          <w:rStyle w:val="citation-56"/>
-          <w:rFonts w:ascii="Arial" w:hAnsi="Arial" w:cs="Arial"/>
-          <w:bCs/>
-        </w:rPr>
-        <w:t>Son senaryo olan Çalışılacaklar Listesi Oluşturma ise günlük görevlerin takibi gereksinimiyle doğrudan eşleşir. Gün içinde bitirilmesi gereken görevler UI üzerinden girildiğinde doğrudan veritabanına eklenir ve uygulamanın yerel veri saklama yapısı sayesinde, program tamamen kapatılsa bile bu liste güvenle korunarak tekrar açılışta kayıpsız bir şekilde geri yüklenir.</w:t>
-      </w:r>
-    </w:p>
-    <w:p>
-      <w:pPr>
-        <w:pStyle w:val="NormalWeb"/>
-        <w:rPr>
-          <w:rFonts w:ascii="Arial" w:hAnsi="Arial" w:cs="Arial"/>
-        </w:rPr>
-      </w:pPr>
-    </w:p>
-    <w:p>
-      <w:pPr>
-        <w:pStyle w:val="NormalWeb"/>
-        <w:rPr>
-          <w:rFonts w:ascii="Arial" w:hAnsi="Arial" w:cs="Arial"/>
-        </w:rPr>
-      </w:pPr>
-    </w:p>
-    <w:p>
-      <w:pPr>
-        <w:pStyle w:val="NormalWeb"/>
-        <w:rPr>
-          <w:rFonts w:ascii="Arial" w:hAnsi="Arial" w:cs="Arial"/>
-        </w:rPr>
-      </w:pPr>
-    </w:p>
-    <w:p>
-      <w:pPr>
-        <w:pStyle w:val="Balk2"/>
-        <w:rPr>
-          <w:rFonts w:ascii="Arial" w:hAnsi="Arial" w:cs="Arial"/>
-          <w:color w:val="auto"/>
-        </w:rPr>
-      </w:pPr>
-      <w:r>
-        <w:rPr>
-          <w:rFonts w:ascii="Arial" w:hAnsi="Arial" w:cs="Arial"/>
-          <w:color w:val="auto"/>
-        </w:rPr>
-        <w:lastRenderedPageBreak/>
-        <w:t>5</w:t>
-      </w:r>
-      <w:r>
-        <w:rPr>
-          <w:rFonts w:ascii="Arial" w:hAnsi="Arial" w:cs="Arial"/>
-          <w:color w:val="auto"/>
-        </w:rPr>
-        <w:t>. Design Decisions</w:t>
+        <w:t>5. Design Decisions</w:t>
       </w:r>
     </w:p>
     <w:p>
@@ -2602,11 +2821,576 @@
     </w:p>
     <w:p>
       <w:pPr>
-        <w:rPr>
+        <w:pStyle w:val="NormalWeb"/>
+        <w:rPr>
+          <w:rFonts w:ascii="Arial" w:hAnsi="Arial" w:cs="Arial"/>
+        </w:rPr>
+      </w:pPr>
+    </w:p>
+    <w:p>
+      <w:pPr>
+        <w:rPr>
+          <w:rFonts w:ascii="Arial" w:hAnsi="Arial" w:cs="Arial"/>
           <w:b/>
           <w:bCs/>
-          <w:sz w:val="28"/>
-          <w:szCs w:val="28"/>
+        </w:rPr>
+      </w:pPr>
+      <w:r>
+        <w:rPr>
+          <w:rFonts w:ascii="Arial" w:hAnsi="Arial" w:cs="Arial"/>
+          <w:b/>
+          <w:bCs/>
+        </w:rPr>
+        <w:t>Projede kullanılan tasarım örüntüleri:</w:t>
+      </w:r>
+    </w:p>
+    <w:p>
+      <w:pPr>
+        <w:pStyle w:val="Balk3"/>
+        <w:spacing w:before="360" w:after="210"/>
+        <w:rPr>
+          <w:rFonts w:ascii="Arial" w:hAnsi="Arial" w:cs="Arial"/>
+          <w:b/>
+          <w:color w:val="000000" w:themeColor="text1"/>
+          <w:sz w:val="24"/>
+          <w:szCs w:val="24"/>
+        </w:rPr>
+      </w:pPr>
+      <w:r>
+        <w:rPr>
+          <w:rFonts w:ascii="Arial" w:hAnsi="Arial" w:cs="Arial"/>
+          <w:b/>
+          <w:color w:val="000000" w:themeColor="text1"/>
+          <w:sz w:val="24"/>
+          <w:szCs w:val="24"/>
+        </w:rPr>
+        <w:t>1. Singleton Örüntüsü (DatabaseConnection İçin)</w:t>
+      </w:r>
+    </w:p>
+    <w:p>
+      <w:pPr>
+        <w:pStyle w:val="NormalWeb"/>
+        <w:numPr>
+          <w:ilvl w:val="0"/>
+          <w:numId w:val="11"/>
+        </w:numPr>
+        <w:spacing w:before="0" w:beforeAutospacing="0" w:after="0" w:afterAutospacing="0"/>
+        <w:rPr>
+          <w:rFonts w:ascii="Arial" w:hAnsi="Arial" w:cs="Arial"/>
+          <w:color w:val="000000" w:themeColor="text1"/>
+        </w:rPr>
+      </w:pPr>
+      <w:r>
+        <w:rPr>
+          <w:rStyle w:val="Gl"/>
+          <w:rFonts w:ascii="Arial" w:eastAsiaTheme="majorEastAsia" w:hAnsi="Arial" w:cs="Arial"/>
+          <w:color w:val="000000" w:themeColor="text1"/>
+        </w:rPr>
+        <w:t>Hangi Problem İçin Kullanıldı?</w:t>
+      </w:r>
+      <w:r>
+        <w:rPr>
+          <w:rFonts w:ascii="Arial" w:hAnsi="Arial" w:cs="Arial"/>
+          <w:color w:val="000000" w:themeColor="text1"/>
+        </w:rPr>
+        <w:br/>
+        <w:t>Veritabanı bağlantısının birden fazla yerde açılması, kaynak israfı ve çakışmalara yol açıyordu. Tek bir bağlantı noktası ile bu sorun çözüldü.</w:t>
+      </w:r>
+    </w:p>
+    <w:p>
+      <w:pPr>
+        <w:pStyle w:val="NormalWeb"/>
+        <w:numPr>
+          <w:ilvl w:val="0"/>
+          <w:numId w:val="11"/>
+        </w:numPr>
+        <w:spacing w:before="0" w:beforeAutospacing="0" w:after="0" w:afterAutospacing="0"/>
+        <w:rPr>
+          <w:rFonts w:ascii="Arial" w:hAnsi="Arial" w:cs="Arial"/>
+          <w:color w:val="000000" w:themeColor="text1"/>
+        </w:rPr>
+      </w:pPr>
+      <w:r>
+        <w:rPr>
+          <w:rStyle w:val="Gl"/>
+          <w:rFonts w:ascii="Arial" w:eastAsiaTheme="majorEastAsia" w:hAnsi="Arial" w:cs="Arial"/>
+          <w:color w:val="000000" w:themeColor="text1"/>
+        </w:rPr>
+        <w:t>Mimarinin Neresinde Yer Alıyor?</w:t>
+      </w:r>
+      <w:r>
+        <w:rPr>
+          <w:rFonts w:ascii="Arial" w:hAnsi="Arial" w:cs="Arial"/>
+          <w:color w:val="000000" w:themeColor="text1"/>
+        </w:rPr>
+        <w:br/>
+        <w:t>DAO katmanında, DatabaseConnection sınıfında. Tüm DAO sınıfları (CourseDAO, EventDAO, vb.) bu singleton instance'ı kullanarak veritabanına erişir.</w:t>
+      </w:r>
+    </w:p>
+    <w:p>
+      <w:pPr>
+        <w:pStyle w:val="NormalWeb"/>
+        <w:numPr>
+          <w:ilvl w:val="0"/>
+          <w:numId w:val="11"/>
+        </w:numPr>
+        <w:spacing w:before="0" w:beforeAutospacing="0" w:after="0" w:afterAutospacing="0"/>
+        <w:rPr>
+          <w:rFonts w:ascii="Arial" w:hAnsi="Arial" w:cs="Arial"/>
+          <w:color w:val="000000" w:themeColor="text1"/>
+        </w:rPr>
+      </w:pPr>
+      <w:r>
+        <w:rPr>
+          <w:rStyle w:val="Gl"/>
+          <w:rFonts w:ascii="Arial" w:eastAsiaTheme="majorEastAsia" w:hAnsi="Arial" w:cs="Arial"/>
+          <w:color w:val="000000" w:themeColor="text1"/>
+        </w:rPr>
+        <w:t>Kalite Faktörü Olarak Neye Katkı Sağladı?</w:t>
+      </w:r>
+    </w:p>
+    <w:p>
+      <w:pPr>
+        <w:numPr>
+          <w:ilvl w:val="1"/>
+          <w:numId w:val="11"/>
+        </w:numPr>
+        <w:spacing w:before="60" w:after="60" w:line="240" w:lineRule="auto"/>
+        <w:rPr>
+          <w:rFonts w:ascii="Arial" w:hAnsi="Arial" w:cs="Arial"/>
+          <w:color w:val="000000" w:themeColor="text1"/>
+        </w:rPr>
+      </w:pPr>
+      <w:r>
+        <w:rPr>
+          <w:rStyle w:val="Gl"/>
+          <w:rFonts w:ascii="Arial" w:hAnsi="Arial" w:cs="Arial"/>
+          <w:color w:val="000000" w:themeColor="text1"/>
+        </w:rPr>
+        <w:t>Performance</w:t>
+      </w:r>
+      <w:r>
+        <w:rPr>
+          <w:rFonts w:ascii="Arial" w:hAnsi="Arial" w:cs="Arial"/>
+          <w:color w:val="000000" w:themeColor="text1"/>
+        </w:rPr>
+        <w:t>: Tek bağlantı ile kaynak kullanımı optimize edildi, fazla bağlantı açılmadı.</w:t>
+      </w:r>
+    </w:p>
+    <w:p>
+      <w:pPr>
+        <w:numPr>
+          <w:ilvl w:val="1"/>
+          <w:numId w:val="11"/>
+        </w:numPr>
+        <w:spacing w:before="60" w:after="60" w:line="240" w:lineRule="auto"/>
+        <w:rPr>
+          <w:rFonts w:ascii="Arial" w:hAnsi="Arial" w:cs="Arial"/>
+          <w:color w:val="000000" w:themeColor="text1"/>
+        </w:rPr>
+      </w:pPr>
+      <w:r>
+        <w:rPr>
+          <w:rStyle w:val="Gl"/>
+          <w:rFonts w:ascii="Arial" w:hAnsi="Arial" w:cs="Arial"/>
+          <w:color w:val="000000" w:themeColor="text1"/>
+        </w:rPr>
+        <w:t>Reliability</w:t>
+      </w:r>
+      <w:r>
+        <w:rPr>
+          <w:rFonts w:ascii="Arial" w:hAnsi="Arial" w:cs="Arial"/>
+          <w:color w:val="000000" w:themeColor="text1"/>
+        </w:rPr>
+        <w:t>: Bağlantı yönetimi merkezi hale geldi, bağlantı hataları kolay kontrol edildi.</w:t>
+      </w:r>
+    </w:p>
+    <w:p>
+      <w:pPr>
+        <w:numPr>
+          <w:ilvl w:val="1"/>
+          <w:numId w:val="11"/>
+        </w:numPr>
+        <w:spacing w:before="60" w:after="60" w:line="240" w:lineRule="auto"/>
+        <w:rPr>
+          <w:rFonts w:ascii="Arial" w:hAnsi="Arial" w:cs="Arial"/>
+          <w:color w:val="000000" w:themeColor="text1"/>
+        </w:rPr>
+      </w:pPr>
+      <w:r>
+        <w:rPr>
+          <w:rStyle w:val="Gl"/>
+          <w:rFonts w:ascii="Arial" w:hAnsi="Arial" w:cs="Arial"/>
+          <w:color w:val="000000" w:themeColor="text1"/>
+        </w:rPr>
+        <w:t>Maintainability</w:t>
+      </w:r>
+      <w:r>
+        <w:rPr>
+          <w:rFonts w:ascii="Arial" w:hAnsi="Arial" w:cs="Arial"/>
+          <w:color w:val="000000" w:themeColor="text1"/>
+        </w:rPr>
+        <w:t>: Veritabanı değişiklikleri tek noktadan yapıldı.</w:t>
+      </w:r>
+    </w:p>
+    <w:p>
+      <w:pPr>
+        <w:spacing w:before="60" w:after="60" w:line="240" w:lineRule="auto"/>
+        <w:rPr>
+          <w:rFonts w:ascii="Arial" w:hAnsi="Arial" w:cs="Arial"/>
+          <w:color w:val="000000" w:themeColor="text1"/>
+        </w:rPr>
+      </w:pPr>
+    </w:p>
+    <w:p>
+      <w:pPr>
+        <w:spacing w:before="60" w:after="60" w:line="240" w:lineRule="auto"/>
+        <w:rPr>
+          <w:rFonts w:ascii="Arial" w:hAnsi="Arial" w:cs="Arial"/>
+          <w:color w:val="000000" w:themeColor="text1"/>
+        </w:rPr>
+      </w:pPr>
+    </w:p>
+    <w:p>
+      <w:pPr>
+        <w:pStyle w:val="NormalWeb"/>
+        <w:numPr>
+          <w:ilvl w:val="0"/>
+          <w:numId w:val="11"/>
+        </w:numPr>
+        <w:spacing w:before="0" w:beforeAutospacing="0" w:after="0" w:afterAutospacing="0"/>
+        <w:rPr>
+          <w:rFonts w:ascii="Arial" w:hAnsi="Arial" w:cs="Arial"/>
+          <w:color w:val="000000" w:themeColor="text1"/>
+        </w:rPr>
+      </w:pPr>
+      <w:r>
+        <w:rPr>
+          <w:rStyle w:val="Gl"/>
+          <w:rFonts w:ascii="Arial" w:eastAsiaTheme="majorEastAsia" w:hAnsi="Arial" w:cs="Arial"/>
+          <w:color w:val="000000" w:themeColor="text1"/>
+        </w:rPr>
+        <w:lastRenderedPageBreak/>
+        <w:t>UML Diyagramlarında Gösterimi</w:t>
+      </w:r>
+      <w:r>
+        <w:rPr>
+          <w:rFonts w:ascii="Arial" w:hAnsi="Arial" w:cs="Arial"/>
+          <w:color w:val="000000" w:themeColor="text1"/>
+        </w:rPr>
+        <w:t>:</w:t>
+      </w:r>
+      <w:r>
+        <w:rPr>
+          <w:rFonts w:ascii="Arial" w:hAnsi="Arial" w:cs="Arial"/>
+          <w:color w:val="000000" w:themeColor="text1"/>
+        </w:rPr>
+        <w:br/>
+        <w:t>Class Diagram'da </w:t>
+      </w:r>
+      <w:r>
+        <w:rPr>
+          <w:rFonts w:ascii="Arial" w:hAnsi="Arial" w:cs="Arial"/>
+          <w:color w:val="000000" w:themeColor="text1"/>
+        </w:rPr>
+        <w:t>DatabaseConnection</w:t>
+      </w:r>
+      <w:r>
+        <w:rPr>
+          <w:rFonts w:ascii="Arial" w:hAnsi="Arial" w:cs="Arial"/>
+          <w:color w:val="000000" w:themeColor="text1"/>
+        </w:rPr>
+        <w:t> sınıfı </w:t>
+      </w:r>
+      <w:r>
+        <w:rPr>
+          <w:rFonts w:ascii="Arial" w:hAnsi="Arial" w:cs="Arial"/>
+          <w:color w:val="000000" w:themeColor="text1"/>
+        </w:rPr>
+        <w:t>&lt;&lt;Singleton&gt;&gt;</w:t>
+      </w:r>
+      <w:r>
+        <w:rPr>
+          <w:rFonts w:ascii="Arial" w:hAnsi="Arial" w:cs="Arial"/>
+          <w:color w:val="000000" w:themeColor="text1"/>
+        </w:rPr>
+        <w:t> stereotipi ile işaretlendi. Component Diagram'da "DatabaseConnection (Singleton)" olarak etiketlendi.</w:t>
+      </w:r>
+    </w:p>
+    <w:p>
+      <w:pPr>
+        <w:pStyle w:val="NormalWeb"/>
+        <w:spacing w:before="0" w:beforeAutospacing="0" w:after="0" w:afterAutospacing="0"/>
+        <w:rPr>
+          <w:rFonts w:ascii="Arial" w:hAnsi="Arial" w:cs="Arial"/>
+          <w:color w:val="000000" w:themeColor="text1"/>
+        </w:rPr>
+      </w:pPr>
+    </w:p>
+    <w:p>
+      <w:pPr>
+        <w:pStyle w:val="Balk3"/>
+        <w:spacing w:before="360" w:after="210"/>
+        <w:rPr>
+          <w:rFonts w:ascii="Arial" w:hAnsi="Arial" w:cs="Arial"/>
+          <w:b/>
+          <w:color w:val="000000" w:themeColor="text1"/>
+          <w:sz w:val="24"/>
+          <w:szCs w:val="24"/>
+        </w:rPr>
+      </w:pPr>
+      <w:r>
+        <w:rPr>
+          <w:rFonts w:ascii="Arial" w:hAnsi="Arial" w:cs="Arial"/>
+          <w:b/>
+          <w:color w:val="000000" w:themeColor="text1"/>
+          <w:sz w:val="24"/>
+          <w:szCs w:val="24"/>
+        </w:rPr>
+        <w:t>2. Observer Örüntüsü (PomodoroTimer İçin)</w:t>
+      </w:r>
+    </w:p>
+    <w:p>
+      <w:pPr>
+        <w:pStyle w:val="NormalWeb"/>
+        <w:numPr>
+          <w:ilvl w:val="0"/>
+          <w:numId w:val="12"/>
+        </w:numPr>
+        <w:spacing w:before="0" w:beforeAutospacing="0" w:after="0" w:afterAutospacing="0"/>
+        <w:rPr>
+          <w:rFonts w:ascii="Arial" w:hAnsi="Arial" w:cs="Arial"/>
+          <w:color w:val="000000" w:themeColor="text1"/>
+        </w:rPr>
+      </w:pPr>
+      <w:r>
+        <w:rPr>
+          <w:rStyle w:val="Gl"/>
+          <w:rFonts w:ascii="Arial" w:eastAsiaTheme="majorEastAsia" w:hAnsi="Arial" w:cs="Arial"/>
+          <w:color w:val="000000" w:themeColor="text1"/>
+        </w:rPr>
+        <w:t>Hangi Problem İçin Kullanıldı?</w:t>
+      </w:r>
+      <w:r>
+        <w:rPr>
+          <w:rFonts w:ascii="Arial" w:hAnsi="Arial" w:cs="Arial"/>
+          <w:color w:val="000000" w:themeColor="text1"/>
+        </w:rPr>
+        <w:br/>
+        <w:t>PomodoroTimer'ın durumu (tick, session complete) UI bileşenlerine (MainController, NotificationUtil) sıkı bağlı olmadan bildirilmesi gerekiyordu. Timer değiştiğinde UI'nin otomatik güncellenmesi sorunu çözüldü.</w:t>
+      </w:r>
+    </w:p>
+    <w:p>
+      <w:pPr>
+        <w:pStyle w:val="NormalWeb"/>
+        <w:numPr>
+          <w:ilvl w:val="0"/>
+          <w:numId w:val="12"/>
+        </w:numPr>
+        <w:spacing w:before="0" w:beforeAutospacing="0" w:after="0" w:afterAutospacing="0"/>
+        <w:rPr>
+          <w:rFonts w:ascii="Arial" w:hAnsi="Arial" w:cs="Arial"/>
+          <w:color w:val="000000" w:themeColor="text1"/>
+        </w:rPr>
+      </w:pPr>
+      <w:r>
+        <w:rPr>
+          <w:rStyle w:val="Gl"/>
+          <w:rFonts w:ascii="Arial" w:eastAsiaTheme="majorEastAsia" w:hAnsi="Arial" w:cs="Arial"/>
+          <w:color w:val="000000" w:themeColor="text1"/>
+        </w:rPr>
+        <w:t>Mimarinin Neresinde Yer Alıyor?</w:t>
+      </w:r>
+      <w:r>
+        <w:rPr>
+          <w:rFonts w:ascii="Arial" w:hAnsi="Arial" w:cs="Arial"/>
+          <w:color w:val="000000" w:themeColor="text1"/>
+        </w:rPr>
+        <w:br/>
+        <w:t>Service katmanında (PomodoroTimer - Subject) ve Presentation katmanında (MainController, NotificationUtil - Observer'lar). Timer olayları Controller'a ve Util'e bildirilir.</w:t>
+      </w:r>
+    </w:p>
+    <w:p>
+      <w:pPr>
+        <w:pStyle w:val="NormalWeb"/>
+        <w:numPr>
+          <w:ilvl w:val="0"/>
+          <w:numId w:val="12"/>
+        </w:numPr>
+        <w:spacing w:before="0" w:beforeAutospacing="0" w:after="0" w:afterAutospacing="0"/>
+        <w:rPr>
+          <w:rFonts w:ascii="Arial" w:hAnsi="Arial" w:cs="Arial"/>
+          <w:color w:val="000000" w:themeColor="text1"/>
+        </w:rPr>
+      </w:pPr>
+      <w:r>
+        <w:rPr>
+          <w:rStyle w:val="Gl"/>
+          <w:rFonts w:ascii="Arial" w:eastAsiaTheme="majorEastAsia" w:hAnsi="Arial" w:cs="Arial"/>
+          <w:color w:val="000000" w:themeColor="text1"/>
+        </w:rPr>
+        <w:t>Kalite Faktörü Olarak Neye Katkı Sağladı?</w:t>
+      </w:r>
+    </w:p>
+    <w:p>
+      <w:pPr>
+        <w:numPr>
+          <w:ilvl w:val="1"/>
+          <w:numId w:val="12"/>
+        </w:numPr>
+        <w:spacing w:before="60" w:after="60" w:line="240" w:lineRule="auto"/>
+        <w:rPr>
+          <w:rFonts w:ascii="Arial" w:hAnsi="Arial" w:cs="Arial"/>
+          <w:color w:val="000000" w:themeColor="text1"/>
+        </w:rPr>
+      </w:pPr>
+      <w:r>
+        <w:rPr>
+          <w:rStyle w:val="Gl"/>
+          <w:rFonts w:ascii="Arial" w:hAnsi="Arial" w:cs="Arial"/>
+          <w:color w:val="000000" w:themeColor="text1"/>
+        </w:rPr>
+        <w:t>Loose Coupling</w:t>
+      </w:r>
+      <w:r>
+        <w:rPr>
+          <w:rFonts w:ascii="Arial" w:hAnsi="Arial" w:cs="Arial"/>
+          <w:color w:val="000000" w:themeColor="text1"/>
+        </w:rPr>
+        <w:t>: Timer ile UI ayrıldı, bağımlılık azaldı.</w:t>
+      </w:r>
+    </w:p>
+    <w:p>
+      <w:pPr>
+        <w:numPr>
+          <w:ilvl w:val="1"/>
+          <w:numId w:val="12"/>
+        </w:numPr>
+        <w:spacing w:before="60" w:after="60" w:line="240" w:lineRule="auto"/>
+        <w:rPr>
+          <w:rFonts w:ascii="Arial" w:hAnsi="Arial" w:cs="Arial"/>
+          <w:color w:val="000000" w:themeColor="text1"/>
+        </w:rPr>
+      </w:pPr>
+      <w:r>
+        <w:rPr>
+          <w:rStyle w:val="Gl"/>
+          <w:rFonts w:ascii="Arial" w:hAnsi="Arial" w:cs="Arial"/>
+          <w:color w:val="000000" w:themeColor="text1"/>
+        </w:rPr>
+        <w:t>Extensibility</w:t>
+      </w:r>
+      <w:r>
+        <w:rPr>
+          <w:rFonts w:ascii="Arial" w:hAnsi="Arial" w:cs="Arial"/>
+          <w:color w:val="000000" w:themeColor="text1"/>
+        </w:rPr>
+        <w:t>: Yeni observer'lar (örneğin yeni bir bildirim sistemi) kolay eklenebilir.</w:t>
+      </w:r>
+    </w:p>
+    <w:p>
+      <w:pPr>
+        <w:numPr>
+          <w:ilvl w:val="1"/>
+          <w:numId w:val="12"/>
+        </w:numPr>
+        <w:spacing w:before="60" w:after="60" w:line="240" w:lineRule="auto"/>
+        <w:rPr>
+          <w:rFonts w:ascii="Arial" w:hAnsi="Arial" w:cs="Arial"/>
+          <w:color w:val="000000" w:themeColor="text1"/>
+        </w:rPr>
+      </w:pPr>
+      <w:r>
+        <w:rPr>
+          <w:rStyle w:val="Gl"/>
+          <w:rFonts w:ascii="Arial" w:hAnsi="Arial" w:cs="Arial"/>
+          <w:color w:val="000000" w:themeColor="text1"/>
+        </w:rPr>
+        <w:t>Testability</w:t>
+      </w:r>
+      <w:r>
+        <w:rPr>
+          <w:rFonts w:ascii="Arial" w:hAnsi="Arial" w:cs="Arial"/>
+          <w:color w:val="000000" w:themeColor="text1"/>
+        </w:rPr>
+        <w:t>: Timer ve UI ayrı ayrı test edilebilir, mock observer'lar kullanılabilir.</w:t>
+      </w:r>
+    </w:p>
+    <w:p>
+      <w:pPr>
+        <w:numPr>
+          <w:ilvl w:val="0"/>
+          <w:numId w:val="13"/>
+        </w:numPr>
+        <w:spacing w:after="0" w:line="240" w:lineRule="auto"/>
+        <w:rPr>
+          <w:rFonts w:ascii="Arial" w:eastAsia="Times New Roman" w:hAnsi="Arial" w:cs="Arial"/>
+          <w:color w:val="000000" w:themeColor="text1"/>
+          <w:kern w:val="0"/>
+          <w:lang w:val="tr-TR" w:eastAsia="tr-TR"/>
+          <w14:ligatures w14:val="none"/>
+        </w:rPr>
+      </w:pPr>
+      <w:r>
+        <w:rPr>
+          <w:rFonts w:ascii="Arial" w:eastAsia="Times New Roman" w:hAnsi="Arial" w:cs="Arial"/>
+          <w:b/>
+          <w:bCs/>
+          <w:color w:val="000000" w:themeColor="text1"/>
+          <w:kern w:val="0"/>
+          <w:lang w:val="tr-TR" w:eastAsia="tr-TR"/>
+          <w14:ligatures w14:val="none"/>
+        </w:rPr>
+        <w:t>UML Diyagramlarında Gösterimi</w:t>
+      </w:r>
+      <w:r>
+        <w:rPr>
+          <w:rFonts w:ascii="Arial" w:eastAsia="Times New Roman" w:hAnsi="Arial" w:cs="Arial"/>
+          <w:color w:val="000000" w:themeColor="text1"/>
+          <w:kern w:val="0"/>
+          <w:lang w:val="tr-TR" w:eastAsia="tr-TR"/>
+          <w14:ligatures w14:val="none"/>
+        </w:rPr>
+        <w:t>:</w:t>
+      </w:r>
+      <w:r>
+        <w:rPr>
+          <w:rFonts w:ascii="Arial" w:eastAsia="Times New Roman" w:hAnsi="Arial" w:cs="Arial"/>
+          <w:color w:val="000000" w:themeColor="text1"/>
+          <w:kern w:val="0"/>
+          <w:lang w:val="tr-TR" w:eastAsia="tr-TR"/>
+          <w14:ligatures w14:val="none"/>
+        </w:rPr>
+        <w:br/>
+        <w:t>Class Diagram'da PomodoroTimer &lt;&lt;Subject&gt;&gt; olarak işaretlendi, Observer interface'i tanımlandı, MainController ve NotificationUtil ..|&gt; Observer ile gösterildi. Sequence Diagram'da </w:t>
+      </w:r>
+      <w:r>
+        <w:rPr>
+          <w:rFonts w:ascii="Arial" w:eastAsia="Times New Roman" w:hAnsi="Arial" w:cs="Arial"/>
+          <w:color w:val="000000" w:themeColor="text1"/>
+          <w:kern w:val="0"/>
+          <w:lang w:val="tr-TR" w:eastAsia="tr-TR"/>
+          <w14:ligatures w14:val="none"/>
+        </w:rPr>
+        <w:t>notifyObservers()</w:t>
+      </w:r>
+      <w:r>
+        <w:rPr>
+          <w:rFonts w:ascii="Arial" w:eastAsia="Times New Roman" w:hAnsi="Arial" w:cs="Arial"/>
+          <w:color w:val="000000" w:themeColor="text1"/>
+          <w:kern w:val="0"/>
+          <w:lang w:val="tr-TR" w:eastAsia="tr-TR"/>
+          <w14:ligatures w14:val="none"/>
+        </w:rPr>
+        <w:t xml:space="preserve"> çağrısı ve olay akışı görülüyor. Component Diagram'da "PomodoroTimer (Subject)" ve "NotificationUtil (Observer)" etiketleri var.</w:t>
+      </w:r>
+    </w:p>
+    <w:p>
+      <w:pPr>
+        <w:rPr>
+          <w:rFonts w:ascii="Arial" w:hAnsi="Arial" w:cs="Arial"/>
+          <w:bCs/>
+          <w:color w:val="000000" w:themeColor="text1"/>
         </w:rPr>
       </w:pPr>
     </w:p>
@@ -2621,8 +3405,306 @@
 </file>
 
 <file path=word/numbering.xml><?xml version="1.0" encoding="utf-8"?>
-<w:numbering xmlns:wpc="http://schemas.microsoft.com/office/word/2010/wordprocessingCanvas" xmlns:cx="http://schemas.microsoft.com/office/drawing/2014/chartex" xmlns:cx1="http://schemas.microsoft.com/office/drawing/2015/9/8/chartex" xmlns:cx2="http://schemas.microsoft.com/office/drawing/2015/10/21/chartex" xmlns:cx3="http://schemas.microsoft.com/office/drawing/2016/5/9/chartex" xmlns:cx4="http://schemas.microsoft.com/office/drawing/2016/5/10/chartex" xmlns:cx5="http://schemas.microsoft.com/office/drawing/2016/5/11/chartex" xmlns:cx6="http://schemas.microsoft.com/office/drawing/2016/5/12/chartex" xmlns:cx7="http://schemas.microsoft.com/office/drawing/2016/5/13/chartex" xmlns:cx8="http://schemas.microsoft.com/office/drawing/2016/5/14/chartex" xmlns:mc="http://schemas.openxmlformats.org/markup-compatibility/2006" xmlns:aink="http://schemas.microsoft.com/office/drawing/2016/ink" xmlns:am3d="http://schemas.microsoft.com/office/drawing/2017/model3d" xmlns:o="urn:schemas-microsoft-com:office:office" xmlns:oel="http://schemas.microsoft.com/office/2019/extlst" xmlns:r="http://schemas.openxmlformats.org/officeDocument/2006/relationships" xmlns:m="http://schemas.openxmlformats.org/officeDocument/2006/math" xmlns:v="urn:schemas-microsoft-com:vml" xmlns:wp14="http://schemas.microsoft.com/office/word/2010/wordprocessingDrawing" xmlns:wp="http://schemas.openxmlformats.org/drawingml/2006/wordprocessingDrawing" xmlns:w10="urn:schemas-microsoft-com:office:word" xmlns:w="http://schemas.openxmlformats.org/wordprocessingml/2006/main" xmlns:w14="http://schemas.microsoft.com/office/word/2010/wordml" xmlns:w15="http://schemas.microsoft.com/office/word/2012/wordml" xmlns:w16cex="http://schemas.microsoft.com/office/word/2018/wordml/cex" xmlns:w16cid="http://schemas.microsoft.com/office/word/2016/wordml/cid" xmlns:w16="http://schemas.microsoft.com/office/word/2018/wordml" xmlns:w16du="http://schemas.microsoft.com/office/word/2023/wordml/word16du" xmlns:w16sdtdh="http://schemas.microsoft.com/office/word/2020/wordml/sdtdatahash" xmlns:w16sdtfl="http://schemas.microsoft.com/office/word/2024/wordml/sdtformatlock" xmlns:w16se="http://schemas.microsoft.com/office/word/2015/wordml/symex" xmlns:wpg="http://schemas.microsoft.com/office/word/2010/wordprocessingGroup" xmlns:wpi="http://schemas.microsoft.com/office/word/2010/wordprocessingInk" xmlns:wne="http://schemas.microsoft.com/office/word/2006/wordml" xmlns:wps="http://schemas.microsoft.com/office/word/2010/wordprocessingShape" mc:Ignorable="w14 w15 w16se w16cid w16 w16cex w16sdtdh w16sdtfl w16du wp14">
+<w:numbering xmlns:wpc="http://schemas.microsoft.com/office/word/2010/wordprocessingCanvas" xmlns:cx="http://schemas.microsoft.com/office/drawing/2014/chartex" xmlns:cx1="http://schemas.microsoft.com/office/drawing/2015/9/8/chartex" xmlns:mc="http://schemas.openxmlformats.org/markup-compatibility/2006" xmlns:o="urn:schemas-microsoft-com:office:office" xmlns:r="http://schemas.openxmlformats.org/officeDocument/2006/relationships" xmlns:m="http://schemas.openxmlformats.org/officeDocument/2006/math" xmlns:v="urn:schemas-microsoft-com:vml" xmlns:wp14="http://schemas.microsoft.com/office/word/2010/wordprocessingDrawing" xmlns:wp="http://schemas.openxmlformats.org/drawingml/2006/wordprocessingDrawing" xmlns:w10="urn:schemas-microsoft-com:office:word" xmlns:w="http://schemas.openxmlformats.org/wordprocessingml/2006/main" xmlns:w14="http://schemas.microsoft.com/office/word/2010/wordml" xmlns:w15="http://schemas.microsoft.com/office/word/2012/wordml" xmlns:w16se="http://schemas.microsoft.com/office/word/2015/wordml/symex" xmlns:wpg="http://schemas.microsoft.com/office/word/2010/wordprocessingGroup" xmlns:wpi="http://schemas.microsoft.com/office/word/2010/wordprocessingInk" xmlns:wne="http://schemas.microsoft.com/office/word/2006/wordml" xmlns:wps="http://schemas.microsoft.com/office/word/2010/wordprocessingShape" mc:Ignorable="w14 w15 w16se wp14">
   <w:abstractNum w:abstractNumId="0" w15:restartNumberingAfterBreak="0">
+    <w:nsid w:val="36B73754"/>
+    <w:multiLevelType w:val="multilevel"/>
+    <w:tmpl w:val="81A63BA6"/>
+    <w:lvl w:ilvl="0">
+      <w:start w:val="1"/>
+      <w:numFmt w:val="bullet"/>
+      <w:lvlText w:val=""/>
+      <w:lvlJc w:val="left"/>
+      <w:pPr>
+        <w:tabs>
+          <w:tab w:val="num" w:pos="720"/>
+        </w:tabs>
+        <w:ind w:left="720" w:hanging="360"/>
+      </w:pPr>
+      <w:rPr>
+        <w:rFonts w:ascii="Symbol" w:hAnsi="Symbol" w:hint="default"/>
+        <w:sz w:val="20"/>
+      </w:rPr>
+    </w:lvl>
+    <w:lvl w:ilvl="1" w:tentative="1">
+      <w:start w:val="1"/>
+      <w:numFmt w:val="bullet"/>
+      <w:lvlText w:val="o"/>
+      <w:lvlJc w:val="left"/>
+      <w:pPr>
+        <w:tabs>
+          <w:tab w:val="num" w:pos="1440"/>
+        </w:tabs>
+        <w:ind w:left="1440" w:hanging="360"/>
+      </w:pPr>
+      <w:rPr>
+        <w:rFonts w:ascii="Courier New" w:hAnsi="Courier New" w:hint="default"/>
+        <w:sz w:val="20"/>
+      </w:rPr>
+    </w:lvl>
+    <w:lvl w:ilvl="2" w:tentative="1">
+      <w:start w:val="1"/>
+      <w:numFmt w:val="bullet"/>
+      <w:lvlText w:val=""/>
+      <w:lvlJc w:val="left"/>
+      <w:pPr>
+        <w:tabs>
+          <w:tab w:val="num" w:pos="2160"/>
+        </w:tabs>
+        <w:ind w:left="2160" w:hanging="360"/>
+      </w:pPr>
+      <w:rPr>
+        <w:rFonts w:ascii="Wingdings" w:hAnsi="Wingdings" w:hint="default"/>
+        <w:sz w:val="20"/>
+      </w:rPr>
+    </w:lvl>
+    <w:lvl w:ilvl="3" w:tentative="1">
+      <w:start w:val="1"/>
+      <w:numFmt w:val="bullet"/>
+      <w:lvlText w:val=""/>
+      <w:lvlJc w:val="left"/>
+      <w:pPr>
+        <w:tabs>
+          <w:tab w:val="num" w:pos="2880"/>
+        </w:tabs>
+        <w:ind w:left="2880" w:hanging="360"/>
+      </w:pPr>
+      <w:rPr>
+        <w:rFonts w:ascii="Wingdings" w:hAnsi="Wingdings" w:hint="default"/>
+        <w:sz w:val="20"/>
+      </w:rPr>
+    </w:lvl>
+    <w:lvl w:ilvl="4" w:tentative="1">
+      <w:start w:val="1"/>
+      <w:numFmt w:val="bullet"/>
+      <w:lvlText w:val=""/>
+      <w:lvlJc w:val="left"/>
+      <w:pPr>
+        <w:tabs>
+          <w:tab w:val="num" w:pos="3600"/>
+        </w:tabs>
+        <w:ind w:left="3600" w:hanging="360"/>
+      </w:pPr>
+      <w:rPr>
+        <w:rFonts w:ascii="Wingdings" w:hAnsi="Wingdings" w:hint="default"/>
+        <w:sz w:val="20"/>
+      </w:rPr>
+    </w:lvl>
+    <w:lvl w:ilvl="5" w:tentative="1">
+      <w:start w:val="1"/>
+      <w:numFmt w:val="bullet"/>
+      <w:lvlText w:val=""/>
+      <w:lvlJc w:val="left"/>
+      <w:pPr>
+        <w:tabs>
+          <w:tab w:val="num" w:pos="4320"/>
+        </w:tabs>
+        <w:ind w:left="4320" w:hanging="360"/>
+      </w:pPr>
+      <w:rPr>
+        <w:rFonts w:ascii="Wingdings" w:hAnsi="Wingdings" w:hint="default"/>
+        <w:sz w:val="20"/>
+      </w:rPr>
+    </w:lvl>
+    <w:lvl w:ilvl="6" w:tentative="1">
+      <w:start w:val="1"/>
+      <w:numFmt w:val="bullet"/>
+      <w:lvlText w:val=""/>
+      <w:lvlJc w:val="left"/>
+      <w:pPr>
+        <w:tabs>
+          <w:tab w:val="num" w:pos="5040"/>
+        </w:tabs>
+        <w:ind w:left="5040" w:hanging="360"/>
+      </w:pPr>
+      <w:rPr>
+        <w:rFonts w:ascii="Wingdings" w:hAnsi="Wingdings" w:hint="default"/>
+        <w:sz w:val="20"/>
+      </w:rPr>
+    </w:lvl>
+    <w:lvl w:ilvl="7" w:tentative="1">
+      <w:start w:val="1"/>
+      <w:numFmt w:val="bullet"/>
+      <w:lvlText w:val=""/>
+      <w:lvlJc w:val="left"/>
+      <w:pPr>
+        <w:tabs>
+          <w:tab w:val="num" w:pos="5760"/>
+        </w:tabs>
+        <w:ind w:left="5760" w:hanging="360"/>
+      </w:pPr>
+      <w:rPr>
+        <w:rFonts w:ascii="Wingdings" w:hAnsi="Wingdings" w:hint="default"/>
+        <w:sz w:val="20"/>
+      </w:rPr>
+    </w:lvl>
+    <w:lvl w:ilvl="8" w:tentative="1">
+      <w:start w:val="1"/>
+      <w:numFmt w:val="bullet"/>
+      <w:lvlText w:val=""/>
+      <w:lvlJc w:val="left"/>
+      <w:pPr>
+        <w:tabs>
+          <w:tab w:val="num" w:pos="6480"/>
+        </w:tabs>
+        <w:ind w:left="6480" w:hanging="360"/>
+      </w:pPr>
+      <w:rPr>
+        <w:rFonts w:ascii="Wingdings" w:hAnsi="Wingdings" w:hint="default"/>
+        <w:sz w:val="20"/>
+      </w:rPr>
+    </w:lvl>
+  </w:abstractNum>
+  <w:abstractNum w:abstractNumId="1" w15:restartNumberingAfterBreak="0">
+    <w:nsid w:val="3CE3188F"/>
+    <w:multiLevelType w:val="multilevel"/>
+    <w:tmpl w:val="9F420D3A"/>
+    <w:lvl w:ilvl="0">
+      <w:start w:val="1"/>
+      <w:numFmt w:val="bullet"/>
+      <w:lvlText w:val=""/>
+      <w:lvlJc w:val="left"/>
+      <w:pPr>
+        <w:tabs>
+          <w:tab w:val="num" w:pos="720"/>
+        </w:tabs>
+        <w:ind w:left="720" w:hanging="360"/>
+      </w:pPr>
+      <w:rPr>
+        <w:rFonts w:ascii="Symbol" w:hAnsi="Symbol" w:hint="default"/>
+        <w:sz w:val="20"/>
+      </w:rPr>
+    </w:lvl>
+    <w:lvl w:ilvl="1">
+      <w:start w:val="1"/>
+      <w:numFmt w:val="bullet"/>
+      <w:lvlText w:val="o"/>
+      <w:lvlJc w:val="left"/>
+      <w:pPr>
+        <w:tabs>
+          <w:tab w:val="num" w:pos="1440"/>
+        </w:tabs>
+        <w:ind w:left="1440" w:hanging="360"/>
+      </w:pPr>
+      <w:rPr>
+        <w:rFonts w:ascii="Courier New" w:hAnsi="Courier New" w:hint="default"/>
+        <w:sz w:val="20"/>
+      </w:rPr>
+    </w:lvl>
+    <w:lvl w:ilvl="2" w:tentative="1">
+      <w:start w:val="1"/>
+      <w:numFmt w:val="bullet"/>
+      <w:lvlText w:val=""/>
+      <w:lvlJc w:val="left"/>
+      <w:pPr>
+        <w:tabs>
+          <w:tab w:val="num" w:pos="2160"/>
+        </w:tabs>
+        <w:ind w:left="2160" w:hanging="360"/>
+      </w:pPr>
+      <w:rPr>
+        <w:rFonts w:ascii="Wingdings" w:hAnsi="Wingdings" w:hint="default"/>
+        <w:sz w:val="20"/>
+      </w:rPr>
+    </w:lvl>
+    <w:lvl w:ilvl="3" w:tentative="1">
+      <w:start w:val="1"/>
+      <w:numFmt w:val="bullet"/>
+      <w:lvlText w:val=""/>
+      <w:lvlJc w:val="left"/>
+      <w:pPr>
+        <w:tabs>
+          <w:tab w:val="num" w:pos="2880"/>
+        </w:tabs>
+        <w:ind w:left="2880" w:hanging="360"/>
+      </w:pPr>
+      <w:rPr>
+        <w:rFonts w:ascii="Wingdings" w:hAnsi="Wingdings" w:hint="default"/>
+        <w:sz w:val="20"/>
+      </w:rPr>
+    </w:lvl>
+    <w:lvl w:ilvl="4" w:tentative="1">
+      <w:start w:val="1"/>
+      <w:numFmt w:val="bullet"/>
+      <w:lvlText w:val=""/>
+      <w:lvlJc w:val="left"/>
+      <w:pPr>
+        <w:tabs>
+          <w:tab w:val="num" w:pos="3600"/>
+        </w:tabs>
+        <w:ind w:left="3600" w:hanging="360"/>
+      </w:pPr>
+      <w:rPr>
+        <w:rFonts w:ascii="Wingdings" w:hAnsi="Wingdings" w:hint="default"/>
+        <w:sz w:val="20"/>
+      </w:rPr>
+    </w:lvl>
+    <w:lvl w:ilvl="5" w:tentative="1">
+      <w:start w:val="1"/>
+      <w:numFmt w:val="bullet"/>
+      <w:lvlText w:val=""/>
+      <w:lvlJc w:val="left"/>
+      <w:pPr>
+        <w:tabs>
+          <w:tab w:val="num" w:pos="4320"/>
+        </w:tabs>
+        <w:ind w:left="4320" w:hanging="360"/>
+      </w:pPr>
+      <w:rPr>
+        <w:rFonts w:ascii="Wingdings" w:hAnsi="Wingdings" w:hint="default"/>
+        <w:sz w:val="20"/>
+      </w:rPr>
+    </w:lvl>
+    <w:lvl w:ilvl="6" w:tentative="1">
+      <w:start w:val="1"/>
+      <w:numFmt w:val="bullet"/>
+      <w:lvlText w:val=""/>
+      <w:lvlJc w:val="left"/>
+      <w:pPr>
+        <w:tabs>
+          <w:tab w:val="num" w:pos="5040"/>
+        </w:tabs>
+        <w:ind w:left="5040" w:hanging="360"/>
+      </w:pPr>
+      <w:rPr>
+        <w:rFonts w:ascii="Wingdings" w:hAnsi="Wingdings" w:hint="default"/>
+        <w:sz w:val="20"/>
+      </w:rPr>
+    </w:lvl>
+    <w:lvl w:ilvl="7" w:tentative="1">
+      <w:start w:val="1"/>
+      <w:numFmt w:val="bullet"/>
+      <w:lvlText w:val=""/>
+      <w:lvlJc w:val="left"/>
+      <w:pPr>
+        <w:tabs>
+          <w:tab w:val="num" w:pos="5760"/>
+        </w:tabs>
+        <w:ind w:left="5760" w:hanging="360"/>
+      </w:pPr>
+      <w:rPr>
+        <w:rFonts w:ascii="Wingdings" w:hAnsi="Wingdings" w:hint="default"/>
+        <w:sz w:val="20"/>
+      </w:rPr>
+    </w:lvl>
+    <w:lvl w:ilvl="8" w:tentative="1">
+      <w:start w:val="1"/>
+      <w:numFmt w:val="bullet"/>
+      <w:lvlText w:val=""/>
+      <w:lvlJc w:val="left"/>
+      <w:pPr>
+        <w:tabs>
+          <w:tab w:val="num" w:pos="6480"/>
+        </w:tabs>
+        <w:ind w:left="6480" w:hanging="360"/>
+      </w:pPr>
+      <w:rPr>
+        <w:rFonts w:ascii="Wingdings" w:hAnsi="Wingdings" w:hint="default"/>
+        <w:sz w:val="20"/>
+      </w:rPr>
+    </w:lvl>
+  </w:abstractNum>
+  <w:abstractNum w:abstractNumId="2" w15:restartNumberingAfterBreak="0">
     <w:nsid w:val="43764054"/>
     <w:multiLevelType w:val="hybridMultilevel"/>
     <w:tmpl w:val="59B28F7C"/>
@@ -2711,7 +3793,156 @@
       </w:pPr>
     </w:lvl>
   </w:abstractNum>
-  <w:abstractNum w:abstractNumId="1" w15:restartNumberingAfterBreak="0">
+  <w:abstractNum w:abstractNumId="3" w15:restartNumberingAfterBreak="0">
+    <w:nsid w:val="4D160B7D"/>
+    <w:multiLevelType w:val="multilevel"/>
+    <w:tmpl w:val="DE32B584"/>
+    <w:lvl w:ilvl="0">
+      <w:start w:val="1"/>
+      <w:numFmt w:val="bullet"/>
+      <w:lvlText w:val=""/>
+      <w:lvlJc w:val="left"/>
+      <w:pPr>
+        <w:tabs>
+          <w:tab w:val="num" w:pos="720"/>
+        </w:tabs>
+        <w:ind w:left="720" w:hanging="360"/>
+      </w:pPr>
+      <w:rPr>
+        <w:rFonts w:ascii="Symbol" w:hAnsi="Symbol" w:hint="default"/>
+        <w:sz w:val="20"/>
+      </w:rPr>
+    </w:lvl>
+    <w:lvl w:ilvl="1">
+      <w:start w:val="1"/>
+      <w:numFmt w:val="bullet"/>
+      <w:lvlText w:val="o"/>
+      <w:lvlJc w:val="left"/>
+      <w:pPr>
+        <w:tabs>
+          <w:tab w:val="num" w:pos="1440"/>
+        </w:tabs>
+        <w:ind w:left="1440" w:hanging="360"/>
+      </w:pPr>
+      <w:rPr>
+        <w:rFonts w:ascii="Courier New" w:hAnsi="Courier New" w:hint="default"/>
+        <w:sz w:val="20"/>
+      </w:rPr>
+    </w:lvl>
+    <w:lvl w:ilvl="2" w:tentative="1">
+      <w:start w:val="1"/>
+      <w:numFmt w:val="bullet"/>
+      <w:lvlText w:val=""/>
+      <w:lvlJc w:val="left"/>
+      <w:pPr>
+        <w:tabs>
+          <w:tab w:val="num" w:pos="2160"/>
+        </w:tabs>
+        <w:ind w:left="2160" w:hanging="360"/>
+      </w:pPr>
+      <w:rPr>
+        <w:rFonts w:ascii="Wingdings" w:hAnsi="Wingdings" w:hint="default"/>
+        <w:sz w:val="20"/>
+      </w:rPr>
+    </w:lvl>
+    <w:lvl w:ilvl="3" w:tentative="1">
+      <w:start w:val="1"/>
+      <w:numFmt w:val="bullet"/>
+      <w:lvlText w:val=""/>
+      <w:lvlJc w:val="left"/>
+      <w:pPr>
+        <w:tabs>
+          <w:tab w:val="num" w:pos="2880"/>
+        </w:tabs>
+        <w:ind w:left="2880" w:hanging="360"/>
+      </w:pPr>
+      <w:rPr>
+        <w:rFonts w:ascii="Wingdings" w:hAnsi="Wingdings" w:hint="default"/>
+        <w:sz w:val="20"/>
+      </w:rPr>
+    </w:lvl>
+    <w:lvl w:ilvl="4" w:tentative="1">
+      <w:start w:val="1"/>
+      <w:numFmt w:val="bullet"/>
+      <w:lvlText w:val=""/>
+      <w:lvlJc w:val="left"/>
+      <w:pPr>
+        <w:tabs>
+          <w:tab w:val="num" w:pos="3600"/>
+        </w:tabs>
+        <w:ind w:left="3600" w:hanging="360"/>
+      </w:pPr>
+      <w:rPr>
+        <w:rFonts w:ascii="Wingdings" w:hAnsi="Wingdings" w:hint="default"/>
+        <w:sz w:val="20"/>
+      </w:rPr>
+    </w:lvl>
+    <w:lvl w:ilvl="5" w:tentative="1">
+      <w:start w:val="1"/>
+      <w:numFmt w:val="bullet"/>
+      <w:lvlText w:val=""/>
+      <w:lvlJc w:val="left"/>
+      <w:pPr>
+        <w:tabs>
+          <w:tab w:val="num" w:pos="4320"/>
+        </w:tabs>
+        <w:ind w:left="4320" w:hanging="360"/>
+      </w:pPr>
+      <w:rPr>
+        <w:rFonts w:ascii="Wingdings" w:hAnsi="Wingdings" w:hint="default"/>
+        <w:sz w:val="20"/>
+      </w:rPr>
+    </w:lvl>
+    <w:lvl w:ilvl="6" w:tentative="1">
+      <w:start w:val="1"/>
+      <w:numFmt w:val="bullet"/>
+      <w:lvlText w:val=""/>
+      <w:lvlJc w:val="left"/>
+      <w:pPr>
+        <w:tabs>
+          <w:tab w:val="num" w:pos="5040"/>
+        </w:tabs>
+        <w:ind w:left="5040" w:hanging="360"/>
+      </w:pPr>
+      <w:rPr>
+        <w:rFonts w:ascii="Wingdings" w:hAnsi="Wingdings" w:hint="default"/>
+        <w:sz w:val="20"/>
+      </w:rPr>
+    </w:lvl>
+    <w:lvl w:ilvl="7" w:tentative="1">
+      <w:start w:val="1"/>
+      <w:numFmt w:val="bullet"/>
+      <w:lvlText w:val=""/>
+      <w:lvlJc w:val="left"/>
+      <w:pPr>
+        <w:tabs>
+          <w:tab w:val="num" w:pos="5760"/>
+        </w:tabs>
+        <w:ind w:left="5760" w:hanging="360"/>
+      </w:pPr>
+      <w:rPr>
+        <w:rFonts w:ascii="Wingdings" w:hAnsi="Wingdings" w:hint="default"/>
+        <w:sz w:val="20"/>
+      </w:rPr>
+    </w:lvl>
+    <w:lvl w:ilvl="8" w:tentative="1">
+      <w:start w:val="1"/>
+      <w:numFmt w:val="bullet"/>
+      <w:lvlText w:val=""/>
+      <w:lvlJc w:val="left"/>
+      <w:pPr>
+        <w:tabs>
+          <w:tab w:val="num" w:pos="6480"/>
+        </w:tabs>
+        <w:ind w:left="6480" w:hanging="360"/>
+      </w:pPr>
+      <w:rPr>
+        <w:rFonts w:ascii="Wingdings" w:hAnsi="Wingdings" w:hint="default"/>
+        <w:sz w:val="20"/>
+      </w:rPr>
+    </w:lvl>
+  </w:abstractNum>
+  <w:abstractNum w:abstractNumId="4" w15:restartNumberingAfterBreak="0">
     <w:nsid w:val="4E9A3018"/>
     <w:multiLevelType w:val="multilevel"/>
     <w:tmpl w:val="A7501BB2"/>
@@ -2860,7 +4091,245 @@
       </w:rPr>
     </w:lvl>
   </w:abstractNum>
-  <w:abstractNum w:abstractNumId="2" w15:restartNumberingAfterBreak="0">
+  <w:abstractNum w:abstractNumId="5" w15:restartNumberingAfterBreak="0">
+    <w:nsid w:val="51B3018F"/>
+    <w:multiLevelType w:val="hybridMultilevel"/>
+    <w:tmpl w:val="FEA6B1D0"/>
+    <w:lvl w:ilvl="0" w:tplc="041F000F">
+      <w:start w:val="1"/>
+      <w:numFmt w:val="decimal"/>
+      <w:lvlText w:val="%1."/>
+      <w:lvlJc w:val="left"/>
+      <w:pPr>
+        <w:ind w:left="720" w:hanging="360"/>
+      </w:pPr>
+      <w:rPr>
+        <w:rFonts w:hint="default"/>
+      </w:rPr>
+    </w:lvl>
+    <w:lvl w:ilvl="1" w:tplc="041F0019" w:tentative="1">
+      <w:start w:val="1"/>
+      <w:numFmt w:val="lowerLetter"/>
+      <w:lvlText w:val="%2."/>
+      <w:lvlJc w:val="left"/>
+      <w:pPr>
+        <w:ind w:left="1440" w:hanging="360"/>
+      </w:pPr>
+    </w:lvl>
+    <w:lvl w:ilvl="2" w:tplc="041F001B" w:tentative="1">
+      <w:start w:val="1"/>
+      <w:numFmt w:val="lowerRoman"/>
+      <w:lvlText w:val="%3."/>
+      <w:lvlJc w:val="right"/>
+      <w:pPr>
+        <w:ind w:left="2160" w:hanging="180"/>
+      </w:pPr>
+    </w:lvl>
+    <w:lvl w:ilvl="3" w:tplc="041F000F" w:tentative="1">
+      <w:start w:val="1"/>
+      <w:numFmt w:val="decimal"/>
+      <w:lvlText w:val="%4."/>
+      <w:lvlJc w:val="left"/>
+      <w:pPr>
+        <w:ind w:left="2880" w:hanging="360"/>
+      </w:pPr>
+    </w:lvl>
+    <w:lvl w:ilvl="4" w:tplc="041F0019" w:tentative="1">
+      <w:start w:val="1"/>
+      <w:numFmt w:val="lowerLetter"/>
+      <w:lvlText w:val="%5."/>
+      <w:lvlJc w:val="left"/>
+      <w:pPr>
+        <w:ind w:left="3600" w:hanging="360"/>
+      </w:pPr>
+    </w:lvl>
+    <w:lvl w:ilvl="5" w:tplc="041F001B" w:tentative="1">
+      <w:start w:val="1"/>
+      <w:numFmt w:val="lowerRoman"/>
+      <w:lvlText w:val="%6."/>
+      <w:lvlJc w:val="right"/>
+      <w:pPr>
+        <w:ind w:left="4320" w:hanging="180"/>
+      </w:pPr>
+    </w:lvl>
+    <w:lvl w:ilvl="6" w:tplc="041F000F" w:tentative="1">
+      <w:start w:val="1"/>
+      <w:numFmt w:val="decimal"/>
+      <w:lvlText w:val="%7."/>
+      <w:lvlJc w:val="left"/>
+      <w:pPr>
+        <w:ind w:left="5040" w:hanging="360"/>
+      </w:pPr>
+    </w:lvl>
+    <w:lvl w:ilvl="7" w:tplc="041F0019" w:tentative="1">
+      <w:start w:val="1"/>
+      <w:numFmt w:val="lowerLetter"/>
+      <w:lvlText w:val="%8."/>
+      <w:lvlJc w:val="left"/>
+      <w:pPr>
+        <w:ind w:left="5760" w:hanging="360"/>
+      </w:pPr>
+    </w:lvl>
+    <w:lvl w:ilvl="8" w:tplc="041F001B" w:tentative="1">
+      <w:start w:val="1"/>
+      <w:numFmt w:val="lowerRoman"/>
+      <w:lvlText w:val="%9."/>
+      <w:lvlJc w:val="right"/>
+      <w:pPr>
+        <w:ind w:left="6480" w:hanging="180"/>
+      </w:pPr>
+    </w:lvl>
+  </w:abstractNum>
+  <w:abstractNum w:abstractNumId="6" w15:restartNumberingAfterBreak="0">
+    <w:nsid w:val="53C870E4"/>
+    <w:multiLevelType w:val="multilevel"/>
+    <w:tmpl w:val="65226720"/>
+    <w:lvl w:ilvl="0">
+      <w:start w:val="1"/>
+      <w:numFmt w:val="bullet"/>
+      <w:lvlText w:val=""/>
+      <w:lvlJc w:val="left"/>
+      <w:pPr>
+        <w:tabs>
+          <w:tab w:val="num" w:pos="720"/>
+        </w:tabs>
+        <w:ind w:left="720" w:hanging="360"/>
+      </w:pPr>
+      <w:rPr>
+        <w:rFonts w:ascii="Symbol" w:hAnsi="Symbol" w:hint="default"/>
+        <w:sz w:val="20"/>
+      </w:rPr>
+    </w:lvl>
+    <w:lvl w:ilvl="1">
+      <w:start w:val="1"/>
+      <w:numFmt w:val="bullet"/>
+      <w:lvlText w:val="o"/>
+      <w:lvlJc w:val="left"/>
+      <w:pPr>
+        <w:tabs>
+          <w:tab w:val="num" w:pos="1440"/>
+        </w:tabs>
+        <w:ind w:left="1440" w:hanging="360"/>
+      </w:pPr>
+      <w:rPr>
+        <w:rFonts w:ascii="Courier New" w:hAnsi="Courier New" w:hint="default"/>
+        <w:sz w:val="20"/>
+      </w:rPr>
+    </w:lvl>
+    <w:lvl w:ilvl="2" w:tentative="1">
+      <w:start w:val="1"/>
+      <w:numFmt w:val="bullet"/>
+      <w:lvlText w:val=""/>
+      <w:lvlJc w:val="left"/>
+      <w:pPr>
+        <w:tabs>
+          <w:tab w:val="num" w:pos="2160"/>
+        </w:tabs>
+        <w:ind w:left="2160" w:hanging="360"/>
+      </w:pPr>
+      <w:rPr>
+        <w:rFonts w:ascii="Wingdings" w:hAnsi="Wingdings" w:hint="default"/>
+        <w:sz w:val="20"/>
+      </w:rPr>
+    </w:lvl>
+    <w:lvl w:ilvl="3" w:tentative="1">
+      <w:start w:val="1"/>
+      <w:numFmt w:val="bullet"/>
+      <w:lvlText w:val=""/>
+      <w:lvlJc w:val="left"/>
+      <w:pPr>
+        <w:tabs>
+          <w:tab w:val="num" w:pos="2880"/>
+        </w:tabs>
+        <w:ind w:left="2880" w:hanging="360"/>
+      </w:pPr>
+      <w:rPr>
+        <w:rFonts w:ascii="Wingdings" w:hAnsi="Wingdings" w:hint="default"/>
+        <w:sz w:val="20"/>
+      </w:rPr>
+    </w:lvl>
+    <w:lvl w:ilvl="4" w:tentative="1">
+      <w:start w:val="1"/>
+      <w:numFmt w:val="bullet"/>
+      <w:lvlText w:val=""/>
+      <w:lvlJc w:val="left"/>
+      <w:pPr>
+        <w:tabs>
+          <w:tab w:val="num" w:pos="3600"/>
+        </w:tabs>
+        <w:ind w:left="3600" w:hanging="360"/>
+      </w:pPr>
+      <w:rPr>
+        <w:rFonts w:ascii="Wingdings" w:hAnsi="Wingdings" w:hint="default"/>
+        <w:sz w:val="20"/>
+      </w:rPr>
+    </w:lvl>
+    <w:lvl w:ilvl="5" w:tentative="1">
+      <w:start w:val="1"/>
+      <w:numFmt w:val="bullet"/>
+      <w:lvlText w:val=""/>
+      <w:lvlJc w:val="left"/>
+      <w:pPr>
+        <w:tabs>
+          <w:tab w:val="num" w:pos="4320"/>
+        </w:tabs>
+        <w:ind w:left="4320" w:hanging="360"/>
+      </w:pPr>
+      <w:rPr>
+        <w:rFonts w:ascii="Wingdings" w:hAnsi="Wingdings" w:hint="default"/>
+        <w:sz w:val="20"/>
+      </w:rPr>
+    </w:lvl>
+    <w:lvl w:ilvl="6" w:tentative="1">
+      <w:start w:val="1"/>
+      <w:numFmt w:val="bullet"/>
+      <w:lvlText w:val=""/>
+      <w:lvlJc w:val="left"/>
+      <w:pPr>
+        <w:tabs>
+          <w:tab w:val="num" w:pos="5040"/>
+        </w:tabs>
+        <w:ind w:left="5040" w:hanging="360"/>
+      </w:pPr>
+      <w:rPr>
+        <w:rFonts w:ascii="Wingdings" w:hAnsi="Wingdings" w:hint="default"/>
+        <w:sz w:val="20"/>
+      </w:rPr>
+    </w:lvl>
+    <w:lvl w:ilvl="7" w:tentative="1">
+      <w:start w:val="1"/>
+      <w:numFmt w:val="bullet"/>
+      <w:lvlText w:val=""/>
+      <w:lvlJc w:val="left"/>
+      <w:pPr>
+        <w:tabs>
+          <w:tab w:val="num" w:pos="5760"/>
+        </w:tabs>
+        <w:ind w:left="5760" w:hanging="360"/>
+      </w:pPr>
+      <w:rPr>
+        <w:rFonts w:ascii="Wingdings" w:hAnsi="Wingdings" w:hint="default"/>
+        <w:sz w:val="20"/>
+      </w:rPr>
+    </w:lvl>
+    <w:lvl w:ilvl="8" w:tentative="1">
+      <w:start w:val="1"/>
+      <w:numFmt w:val="bullet"/>
+      <w:lvlText w:val=""/>
+      <w:lvlJc w:val="left"/>
+      <w:pPr>
+        <w:tabs>
+          <w:tab w:val="num" w:pos="6480"/>
+        </w:tabs>
+        <w:ind w:left="6480" w:hanging="360"/>
+      </w:pPr>
+      <w:rPr>
+        <w:rFonts w:ascii="Wingdings" w:hAnsi="Wingdings" w:hint="default"/>
+        <w:sz w:val="20"/>
+      </w:rPr>
+    </w:lvl>
+  </w:abstractNum>
+  <w:abstractNum w:abstractNumId="7" w15:restartNumberingAfterBreak="0">
     <w:nsid w:val="5DC107F5"/>
     <w:multiLevelType w:val="multilevel"/>
     <w:tmpl w:val="D9AC3260"/>
@@ -3009,7 +4478,7 @@
       </w:rPr>
     </w:lvl>
   </w:abstractNum>
-  <w:abstractNum w:abstractNumId="3" w15:restartNumberingAfterBreak="0">
+  <w:abstractNum w:abstractNumId="8" w15:restartNumberingAfterBreak="0">
     <w:nsid w:val="5F354304"/>
     <w:multiLevelType w:val="multilevel"/>
     <w:tmpl w:val="6D7ED2BA"/>
@@ -3158,7 +4627,7 @@
       </w:rPr>
     </w:lvl>
   </w:abstractNum>
-  <w:abstractNum w:abstractNumId="4" w15:restartNumberingAfterBreak="0">
+  <w:abstractNum w:abstractNumId="9" w15:restartNumberingAfterBreak="0">
     <w:nsid w:val="6D4F43D0"/>
     <w:multiLevelType w:val="multilevel"/>
     <w:tmpl w:val="7AC444D0"/>
@@ -3307,7 +4776,7 @@
       </w:rPr>
     </w:lvl>
   </w:abstractNum>
-  <w:abstractNum w:abstractNumId="5" w15:restartNumberingAfterBreak="0">
+  <w:abstractNum w:abstractNumId="10" w15:restartNumberingAfterBreak="0">
     <w:nsid w:val="6D692C99"/>
     <w:multiLevelType w:val="multilevel"/>
     <w:tmpl w:val="276E1FBA"/>
@@ -3420,7 +4889,156 @@
       </w:pPr>
     </w:lvl>
   </w:abstractNum>
-  <w:abstractNum w:abstractNumId="6" w15:restartNumberingAfterBreak="0">
+  <w:abstractNum w:abstractNumId="11" w15:restartNumberingAfterBreak="0">
+    <w:nsid w:val="6D93722D"/>
+    <w:multiLevelType w:val="multilevel"/>
+    <w:tmpl w:val="E6144026"/>
+    <w:lvl w:ilvl="0">
+      <w:start w:val="1"/>
+      <w:numFmt w:val="bullet"/>
+      <w:lvlText w:val=""/>
+      <w:lvlJc w:val="left"/>
+      <w:pPr>
+        <w:tabs>
+          <w:tab w:val="num" w:pos="720"/>
+        </w:tabs>
+        <w:ind w:left="720" w:hanging="360"/>
+      </w:pPr>
+      <w:rPr>
+        <w:rFonts w:ascii="Symbol" w:hAnsi="Symbol" w:hint="default"/>
+        <w:sz w:val="20"/>
+      </w:rPr>
+    </w:lvl>
+    <w:lvl w:ilvl="1">
+      <w:start w:val="1"/>
+      <w:numFmt w:val="bullet"/>
+      <w:lvlText w:val="o"/>
+      <w:lvlJc w:val="left"/>
+      <w:pPr>
+        <w:tabs>
+          <w:tab w:val="num" w:pos="1440"/>
+        </w:tabs>
+        <w:ind w:left="1440" w:hanging="360"/>
+      </w:pPr>
+      <w:rPr>
+        <w:rFonts w:ascii="Courier New" w:hAnsi="Courier New" w:hint="default"/>
+        <w:sz w:val="20"/>
+      </w:rPr>
+    </w:lvl>
+    <w:lvl w:ilvl="2" w:tentative="1">
+      <w:start w:val="1"/>
+      <w:numFmt w:val="bullet"/>
+      <w:lvlText w:val=""/>
+      <w:lvlJc w:val="left"/>
+      <w:pPr>
+        <w:tabs>
+          <w:tab w:val="num" w:pos="2160"/>
+        </w:tabs>
+        <w:ind w:left="2160" w:hanging="360"/>
+      </w:pPr>
+      <w:rPr>
+        <w:rFonts w:ascii="Wingdings" w:hAnsi="Wingdings" w:hint="default"/>
+        <w:sz w:val="20"/>
+      </w:rPr>
+    </w:lvl>
+    <w:lvl w:ilvl="3" w:tentative="1">
+      <w:start w:val="1"/>
+      <w:numFmt w:val="bullet"/>
+      <w:lvlText w:val=""/>
+      <w:lvlJc w:val="left"/>
+      <w:pPr>
+        <w:tabs>
+          <w:tab w:val="num" w:pos="2880"/>
+        </w:tabs>
+        <w:ind w:left="2880" w:hanging="360"/>
+      </w:pPr>
+      <w:rPr>
+        <w:rFonts w:ascii="Wingdings" w:hAnsi="Wingdings" w:hint="default"/>
+        <w:sz w:val="20"/>
+      </w:rPr>
+    </w:lvl>
+    <w:lvl w:ilvl="4" w:tentative="1">
+      <w:start w:val="1"/>
+      <w:numFmt w:val="bullet"/>
+      <w:lvlText w:val=""/>
+      <w:lvlJc w:val="left"/>
+      <w:pPr>
+        <w:tabs>
+          <w:tab w:val="num" w:pos="3600"/>
+        </w:tabs>
+        <w:ind w:left="3600" w:hanging="360"/>
+      </w:pPr>
+      <w:rPr>
+        <w:rFonts w:ascii="Wingdings" w:hAnsi="Wingdings" w:hint="default"/>
+        <w:sz w:val="20"/>
+      </w:rPr>
+    </w:lvl>
+    <w:lvl w:ilvl="5" w:tentative="1">
+      <w:start w:val="1"/>
+      <w:numFmt w:val="bullet"/>
+      <w:lvlText w:val=""/>
+      <w:lvlJc w:val="left"/>
+      <w:pPr>
+        <w:tabs>
+          <w:tab w:val="num" w:pos="4320"/>
+        </w:tabs>
+        <w:ind w:left="4320" w:hanging="360"/>
+      </w:pPr>
+      <w:rPr>
+        <w:rFonts w:ascii="Wingdings" w:hAnsi="Wingdings" w:hint="default"/>
+        <w:sz w:val="20"/>
+      </w:rPr>
+    </w:lvl>
+    <w:lvl w:ilvl="6" w:tentative="1">
+      <w:start w:val="1"/>
+      <w:numFmt w:val="bullet"/>
+      <w:lvlText w:val=""/>
+      <w:lvlJc w:val="left"/>
+      <w:pPr>
+        <w:tabs>
+          <w:tab w:val="num" w:pos="5040"/>
+        </w:tabs>
+        <w:ind w:left="5040" w:hanging="360"/>
+      </w:pPr>
+      <w:rPr>
+        <w:rFonts w:ascii="Wingdings" w:hAnsi="Wingdings" w:hint="default"/>
+        <w:sz w:val="20"/>
+      </w:rPr>
+    </w:lvl>
+    <w:lvl w:ilvl="7" w:tentative="1">
+      <w:start w:val="1"/>
+      <w:numFmt w:val="bullet"/>
+      <w:lvlText w:val=""/>
+      <w:lvlJc w:val="left"/>
+      <w:pPr>
+        <w:tabs>
+          <w:tab w:val="num" w:pos="5760"/>
+        </w:tabs>
+        <w:ind w:left="5760" w:hanging="360"/>
+      </w:pPr>
+      <w:rPr>
+        <w:rFonts w:ascii="Wingdings" w:hAnsi="Wingdings" w:hint="default"/>
+        <w:sz w:val="20"/>
+      </w:rPr>
+    </w:lvl>
+    <w:lvl w:ilvl="8" w:tentative="1">
+      <w:start w:val="1"/>
+      <w:numFmt w:val="bullet"/>
+      <w:lvlText w:val=""/>
+      <w:lvlJc w:val="left"/>
+      <w:pPr>
+        <w:tabs>
+          <w:tab w:val="num" w:pos="6480"/>
+        </w:tabs>
+        <w:ind w:left="6480" w:hanging="360"/>
+      </w:pPr>
+      <w:rPr>
+        <w:rFonts w:ascii="Wingdings" w:hAnsi="Wingdings" w:hint="default"/>
+        <w:sz w:val="20"/>
+      </w:rPr>
+    </w:lvl>
+  </w:abstractNum>
+  <w:abstractNum w:abstractNumId="12" w15:restartNumberingAfterBreak="0">
     <w:nsid w:val="77F015EB"/>
     <w:multiLevelType w:val="multilevel"/>
     <w:tmpl w:val="0DDC1FE4"/>
@@ -3569,32 +5187,50 @@
       </w:rPr>
     </w:lvl>
   </w:abstractNum>
-  <w:num w:numId="1" w16cid:durableId="670567038">
-    <w:abstractNumId w:val="0"/>
+  <w:num w:numId="1">
+    <w:abstractNumId w:val="2"/>
   </w:num>
-  <w:num w:numId="2" w16cid:durableId="1455439755">
+  <w:num w:numId="2">
+    <w:abstractNumId w:val="10"/>
+  </w:num>
+  <w:num w:numId="3">
+    <w:abstractNumId w:val="12"/>
+  </w:num>
+  <w:num w:numId="4">
+    <w:abstractNumId w:val="9"/>
+  </w:num>
+  <w:num w:numId="5">
+    <w:abstractNumId w:val="4"/>
+  </w:num>
+  <w:num w:numId="6">
+    <w:abstractNumId w:val="7"/>
+  </w:num>
+  <w:num w:numId="7">
+    <w:abstractNumId w:val="8"/>
+  </w:num>
+  <w:num w:numId="8">
     <w:abstractNumId w:val="5"/>
   </w:num>
-  <w:num w:numId="3" w16cid:durableId="882910481">
+  <w:num w:numId="9">
     <w:abstractNumId w:val="6"/>
   </w:num>
-  <w:num w:numId="4" w16cid:durableId="1059014016">
-    <w:abstractNumId w:val="4"/>
+  <w:num w:numId="10">
+    <w:abstractNumId w:val="3"/>
   </w:num>
-  <w:num w:numId="5" w16cid:durableId="1315455658">
+  <w:num w:numId="11">
+    <w:abstractNumId w:val="11"/>
+  </w:num>
+  <w:num w:numId="12">
     <w:abstractNumId w:val="1"/>
   </w:num>
-  <w:num w:numId="6" w16cid:durableId="1143157058">
-    <w:abstractNumId w:val="2"/>
-  </w:num>
-  <w:num w:numId="7" w16cid:durableId="1734307474">
-    <w:abstractNumId w:val="3"/>
+  <w:num w:numId="13">
+    <w:abstractNumId w:val="0"/>
   </w:num>
 </w:numbering>
 </file>
 
 <file path=word/styles.xml><?xml version="1.0" encoding="utf-8"?>
-<w:styles xmlns:mc="http://schemas.openxmlformats.org/markup-compatibility/2006" xmlns:r="http://schemas.openxmlformats.org/officeDocument/2006/relationships" xmlns:w="http://schemas.openxmlformats.org/wordprocessingml/2006/main" xmlns:w14="http://schemas.microsoft.com/office/word/2010/wordml" xmlns:w15="http://schemas.microsoft.com/office/word/2012/wordml" xmlns:w16cex="http://schemas.microsoft.com/office/word/2018/wordml/cex" xmlns:w16cid="http://schemas.microsoft.com/office/word/2016/wordml/cid" xmlns:w16="http://schemas.microsoft.com/office/word/2018/wordml" xmlns:w16du="http://schemas.microsoft.com/office/word/2023/wordml/word16du" xmlns:w16sdtdh="http://schemas.microsoft.com/office/word/2020/wordml/sdtdatahash" xmlns:w16sdtfl="http://schemas.microsoft.com/office/word/2024/wordml/sdtformatlock" xmlns:w16se="http://schemas.microsoft.com/office/word/2015/wordml/symex" mc:Ignorable="w14 w15 w16se w16cid w16 w16cex w16sdtdh w16sdtfl w16du">
+<w:styles xmlns:mc="http://schemas.openxmlformats.org/markup-compatibility/2006" xmlns:r="http://schemas.openxmlformats.org/officeDocument/2006/relationships" xmlns:w="http://schemas.openxmlformats.org/wordprocessingml/2006/main" xmlns:w14="http://schemas.microsoft.com/office/word/2010/wordml" xmlns:w15="http://schemas.microsoft.com/office/word/2012/wordml" xmlns:w16se="http://schemas.microsoft.com/office/word/2015/wordml/symex" mc:Ignorable="w14 w15 w16se">
   <w:docDefaults>
     <w:rPrDefault>
       <w:rPr>
@@ -3612,7 +5248,7 @@
       </w:pPr>
     </w:pPrDefault>
   </w:docDefaults>
-  <w:latentStyles w:defLockedState="0" w:defUIPriority="99" w:defSemiHidden="0" w:defUnhideWhenUsed="0" w:defQFormat="0" w:count="376">
+  <w:latentStyles w:defLockedState="0" w:defUIPriority="99" w:defSemiHidden="0" w:defUnhideWhenUsed="0" w:defQFormat="0" w:count="371">
     <w:lsdException w:name="Normal" w:uiPriority="0" w:qFormat="1"/>
     <w:lsdException w:name="heading 1" w:uiPriority="9" w:qFormat="1"/>
     <w:lsdException w:name="heading 2" w:semiHidden="1" w:uiPriority="9" w:unhideWhenUsed="1" w:qFormat="1"/>
@@ -3984,11 +5620,6 @@
     <w:lsdException w:name="List Table 5 Dark Accent 6" w:uiPriority="50"/>
     <w:lsdException w:name="List Table 6 Colorful Accent 6" w:uiPriority="51"/>
     <w:lsdException w:name="List Table 7 Colorful Accent 6" w:uiPriority="52"/>
-    <w:lsdException w:name="Mention" w:semiHidden="1" w:unhideWhenUsed="1"/>
-    <w:lsdException w:name="Smart Hyperlink" w:semiHidden="1" w:unhideWhenUsed="1"/>
-    <w:lsdException w:name="Hashtag" w:semiHidden="1" w:unhideWhenUsed="1"/>
-    <w:lsdException w:name="Unresolved Mention" w:semiHidden="1" w:unhideWhenUsed="1"/>
-    <w:lsdException w:name="Smart Link" w:semiHidden="1" w:unhideWhenUsed="1"/>
   </w:latentStyles>
   <w:style w:type="paragraph" w:default="1" w:styleId="Normal">
     <w:name w:val="Normal"/>
@@ -4690,6 +6321,11 @@
       <w:szCs w:val="20"/>
     </w:rPr>
   </w:style>
+  <w:style w:type="character" w:customStyle="1" w:styleId="icon-label">
+    <w:name w:val="icon-label"/>
+    <w:basedOn w:val="VarsaylanParagrafYazTipi"/>
+    <w:rsid w:val="00DE66EF"/>
+  </w:style>
 </w:styles>
 </file>
 

</xml_diff>

<commit_message>
Project Design Document Fixed
- "Technology Stack" wrong version fixed.
</commit_message>
<xml_diff>
--- a/Docs/PA2 Part 1/Project Design Document.docx
+++ b/Docs/PA2 Part 1/Project Design Document.docx
@@ -972,7 +972,7 @@
             <v:path o:extrusionok="f" gradientshapeok="t" o:connecttype="rect"/>
             <o:lock v:ext="edit" aspectratio="t"/>
           </v:shapetype>
-          <v:shape id="_x0000_i1025" type="#_x0000_t75" style="width:468pt;height:241.1pt">
+          <v:shape id="_x0000_i1025" type="#_x0000_t75" style="width:467.8pt;height:241.2pt">
             <v:imagedata r:id="rId6" o:title="component_diagram"/>
           </v:shape>
         </w:pict>
@@ -1039,7 +1039,7 @@
           <w:rFonts w:ascii="Arial" w:hAnsi="Arial" w:cs="Arial"/>
         </w:rPr>
         <w:pict w14:anchorId="45744019">
-          <v:shape id="_x0000_i1026" type="#_x0000_t75" style="width:467.15pt;height:224.35pt">
+          <v:shape id="_x0000_i1026" type="#_x0000_t75" style="width:467.35pt;height:224.4pt">
             <v:imagedata r:id="rId7" o:title="deployment_diagram"/>
           </v:shape>
         </w:pict>
@@ -1086,7 +1086,16 @@
           <w:rStyle w:val="citation-79"/>
           <w:rFonts w:ascii="Arial" w:hAnsi="Arial" w:cs="Arial"/>
         </w:rPr>
-        <w:t xml:space="preserve"> Java (JDK 17 LTS) </w:t>
+        <w:t xml:space="preserve"> Java (JDK 23</w:t>
+      </w:r>
+      <w:bookmarkStart w:id="0" w:name="_GoBack"/>
+      <w:bookmarkEnd w:id="0"/>
+      <w:r>
+        <w:rPr>
+          <w:rStyle w:val="citation-79"/>
+          <w:rFonts w:ascii="Arial" w:hAnsi="Arial" w:cs="Arial"/>
+        </w:rPr>
+        <w:t xml:space="preserve"> LTS) </w:t>
       </w:r>
     </w:p>
     <w:p>
@@ -2377,7 +2386,7 @@
           <w:rFonts w:ascii="Arial" w:hAnsi="Arial" w:cs="Arial"/>
         </w:rPr>
         <w:pict w14:anchorId="608EA38F">
-          <v:shape id="_x0000_i1027" type="#_x0000_t75" style="width:467.15pt;height:177.5pt">
+          <v:shape id="_x0000_i1027" type="#_x0000_t75" style="width:467.35pt;height:177.55pt">
             <v:imagedata r:id="rId8" o:title="class_diagram"/>
           </v:shape>
         </w:pict>
@@ -2554,8 +2563,6 @@
         </w:rPr>
         <w:t xml:space="preserve"> tetiklenir; bu işlem Java'da ayrı bir thread (iş parçacığı) üzerinde asenkron olarak çalışır ve süre sonlandığında elde edilen toplam zaman, kullanıcının seçtiği derse ait tabloya eklenmek üzere backend üzerinden veritabanına iletilir.</w:t>
       </w:r>
-      <w:bookmarkStart w:id="0" w:name="_GoBack"/>
-      <w:bookmarkEnd w:id="0"/>
     </w:p>
     <w:p>
       <w:pPr>
@@ -2659,7 +2666,7 @@
           <w:rFonts w:ascii="Arial" w:hAnsi="Arial" w:cs="Arial"/>
         </w:rPr>
         <w:pict w14:anchorId="61ED5562">
-          <v:shape id="_x0000_i1028" type="#_x0000_t75" style="width:467.15pt;height:242.8pt">
+          <v:shape id="_x0000_i1028" type="#_x0000_t75" style="width:466.9pt;height:242.95pt">
             <v:imagedata r:id="rId9" o:title="sequence_diagram"/>
           </v:shape>
         </w:pict>

</xml_diff>